<commit_message>
Added lab5 SIAOD final
</commit_message>
<xml_diff>
--- a/DevOps/lab5/lab5.docx
+++ b/DevOps/lab5/lab5.docx
@@ -175,7 +175,6 @@
           <w:rFonts w:ascii="Times New Roman" w:eastAsia="Calibri" w:hAnsi="Times New Roman" w:cs="Times New Roman"/>
           <w:sz w:val="24"/>
           <w:szCs w:val="24"/>
-          <w:lang w:val="en-US"/>
         </w:rPr>
       </w:pPr>
       <w:r>
@@ -185,6 +184,32 @@
           <w:szCs w:val="24"/>
         </w:rPr>
         <w:t>по лабораторной работе №</w:t>
+      </w:r>
+      <w:r>
+        <w:rPr>
+          <w:rFonts w:ascii="Times New Roman" w:eastAsia="Calibri" w:hAnsi="Times New Roman" w:cs="Times New Roman"/>
+          <w:sz w:val="24"/>
+          <w:szCs w:val="24"/>
+        </w:rPr>
+        <w:t>5</w:t>
+      </w:r>
+    </w:p>
+    <w:p>
+      <w:pPr>
+        <w:jc w:val="center"/>
+        <w:rPr>
+          <w:rFonts w:ascii="Times New Roman" w:eastAsia="Calibri" w:hAnsi="Times New Roman" w:cs="Times New Roman"/>
+          <w:sz w:val="24"/>
+          <w:szCs w:val="24"/>
+        </w:rPr>
+      </w:pPr>
+      <w:r>
+        <w:rPr>
+          <w:rFonts w:ascii="Times New Roman" w:eastAsia="Calibri" w:hAnsi="Times New Roman" w:cs="Times New Roman"/>
+          <w:sz w:val="24"/>
+          <w:szCs w:val="24"/>
+        </w:rPr>
+        <w:t xml:space="preserve">по дисциплине «Основы </w:t>
       </w:r>
       <w:r>
         <w:rPr>
@@ -193,34 +218,97 @@
           <w:szCs w:val="24"/>
           <w:lang w:val="en-US"/>
         </w:rPr>
-        <w:t>5</w:t>
-      </w:r>
-    </w:p>
-    <w:p>
-      <w:pPr>
-        <w:jc w:val="center"/>
+        <w:t>DevOps</w:t>
+      </w:r>
+      <w:r>
         <w:rPr>
           <w:rFonts w:ascii="Times New Roman" w:eastAsia="Calibri" w:hAnsi="Times New Roman" w:cs="Times New Roman"/>
           <w:sz w:val="24"/>
           <w:szCs w:val="24"/>
         </w:rPr>
-      </w:pPr>
-      <w:r>
+        <w:t>»</w:t>
+      </w:r>
+    </w:p>
+    <w:p>
+      <w:pPr>
+        <w:jc w:val="center"/>
         <w:rPr>
           <w:rFonts w:ascii="Times New Roman" w:eastAsia="Calibri" w:hAnsi="Times New Roman" w:cs="Times New Roman"/>
           <w:sz w:val="24"/>
           <w:szCs w:val="24"/>
         </w:rPr>
-        <w:t xml:space="preserve">по дисциплине «Основы </w:t>
-      </w:r>
-      <w:r>
+      </w:pPr>
+    </w:p>
+    <w:p>
+      <w:pPr>
+        <w:jc w:val="center"/>
+        <w:rPr>
+          <w:rFonts w:ascii="Times New Roman" w:eastAsia="Calibri" w:hAnsi="Times New Roman" w:cs="Times New Roman"/>
+          <w:sz w:val="28"/>
+          <w:szCs w:val="28"/>
+        </w:rPr>
+      </w:pPr>
+      <w:r>
+        <w:rPr>
+          <w:rFonts w:ascii="Times New Roman" w:eastAsia="Calibri" w:hAnsi="Times New Roman" w:cs="Times New Roman"/>
+          <w:b/>
+          <w:bCs/>
+          <w:sz w:val="28"/>
+          <w:szCs w:val="28"/>
+        </w:rPr>
+        <w:t>Тема</w:t>
+      </w:r>
+    </w:p>
+    <w:p>
+      <w:pPr>
+        <w:jc w:val="center"/>
         <w:rPr>
           <w:rFonts w:ascii="Times New Roman" w:eastAsia="Calibri" w:hAnsi="Times New Roman" w:cs="Times New Roman"/>
           <w:sz w:val="24"/>
           <w:szCs w:val="24"/>
+        </w:rPr>
+      </w:pPr>
+      <w:r>
+        <w:rPr>
+          <w:rFonts w:ascii="Times New Roman" w:eastAsia="Calibri" w:hAnsi="Times New Roman" w:cs="Times New Roman"/>
+          <w:sz w:val="28"/>
+          <w:szCs w:val="28"/>
+        </w:rPr>
+        <w:t>«</w:t>
+      </w:r>
+      <w:r>
+        <w:rPr>
+          <w:rFonts w:ascii="Times New Roman" w:eastAsia="Calibri" w:hAnsi="Times New Roman" w:cs="Times New Roman"/>
+          <w:sz w:val="28"/>
+          <w:szCs w:val="28"/>
+        </w:rPr>
+        <w:t xml:space="preserve">Методология </w:t>
+      </w:r>
+      <w:r>
+        <w:rPr>
+          <w:rFonts w:ascii="Times New Roman" w:eastAsia="Calibri" w:hAnsi="Times New Roman" w:cs="Times New Roman"/>
+          <w:sz w:val="28"/>
+          <w:szCs w:val="28"/>
           <w:lang w:val="en-US"/>
         </w:rPr>
-        <w:t>DevOps</w:t>
+        <w:t>CI</w:t>
+      </w:r>
+      <w:r>
+        <w:rPr>
+          <w:rFonts w:ascii="Times New Roman" w:eastAsia="Calibri" w:hAnsi="Times New Roman" w:cs="Times New Roman"/>
+          <w:sz w:val="28"/>
+          <w:szCs w:val="28"/>
+        </w:rPr>
+        <w:t>/</w:t>
+      </w:r>
+      <w:r>
+        <w:rPr>
+          <w:rFonts w:ascii="Times New Roman" w:eastAsia="Calibri" w:hAnsi="Times New Roman" w:cs="Times New Roman"/>
+          <w:sz w:val="28"/>
+          <w:szCs w:val="28"/>
+          <w:lang w:val="en-US"/>
+        </w:rPr>
+        <w:t>CD</w:t>
       </w:r>
       <w:r>
         <w:rPr>
@@ -233,7 +321,6 @@
     </w:p>
     <w:p>
       <w:pPr>
-        <w:jc w:val="center"/>
         <w:rPr>
           <w:rFonts w:ascii="Times New Roman" w:eastAsia="Calibri" w:hAnsi="Times New Roman" w:cs="Times New Roman"/>
           <w:sz w:val="24"/>
@@ -243,66 +330,21 @@
     </w:p>
     <w:p>
       <w:pPr>
-        <w:jc w:val="center"/>
-        <w:rPr>
-          <w:rFonts w:ascii="Times New Roman" w:eastAsia="Calibri" w:hAnsi="Times New Roman" w:cs="Times New Roman"/>
-          <w:sz w:val="28"/>
-          <w:szCs w:val="28"/>
-        </w:rPr>
-      </w:pPr>
-      <w:r>
-        <w:rPr>
-          <w:rFonts w:ascii="Times New Roman" w:eastAsia="Calibri" w:hAnsi="Times New Roman" w:cs="Times New Roman"/>
-          <w:b/>
-          <w:bCs/>
-          <w:sz w:val="28"/>
-          <w:szCs w:val="28"/>
-        </w:rPr>
-        <w:t>Тема</w:t>
-      </w:r>
-    </w:p>
-    <w:p>
-      <w:pPr>
-        <w:jc w:val="center"/>
         <w:rPr>
           <w:rFonts w:ascii="Times New Roman" w:eastAsia="Calibri" w:hAnsi="Times New Roman" w:cs="Times New Roman"/>
           <w:sz w:val="24"/>
           <w:szCs w:val="24"/>
         </w:rPr>
       </w:pPr>
-      <w:r>
-        <w:rPr>
-          <w:rFonts w:ascii="Times New Roman" w:eastAsia="Calibri" w:hAnsi="Times New Roman" w:cs="Times New Roman"/>
-          <w:sz w:val="28"/>
-          <w:szCs w:val="28"/>
-        </w:rPr>
-        <w:t>«</w:t>
-      </w:r>
-      <w:r>
-        <w:rPr>
-          <w:rFonts w:ascii="Times New Roman" w:eastAsia="Calibri" w:hAnsi="Times New Roman" w:cs="Times New Roman"/>
-          <w:sz w:val="28"/>
-          <w:szCs w:val="28"/>
-        </w:rPr>
-        <w:t xml:space="preserve">Методология </w:t>
-      </w:r>
-      <w:r>
-        <w:rPr>
-          <w:rFonts w:ascii="Times New Roman" w:eastAsia="Calibri" w:hAnsi="Times New Roman" w:cs="Times New Roman"/>
-          <w:sz w:val="28"/>
-          <w:szCs w:val="28"/>
-          <w:lang w:val="en-US"/>
-        </w:rPr>
-        <w:t>CI/CD</w:t>
-      </w:r>
-      <w:r>
+    </w:p>
+    <w:p>
+      <w:pPr>
         <w:rPr>
           <w:rFonts w:ascii="Times New Roman" w:eastAsia="Calibri" w:hAnsi="Times New Roman" w:cs="Times New Roman"/>
           <w:sz w:val="24"/>
           <w:szCs w:val="24"/>
         </w:rPr>
-        <w:t>»</w:t>
-      </w:r>
+      </w:pPr>
     </w:p>
     <w:p>
       <w:pPr>
@@ -315,30 +357,29 @@
     </w:p>
     <w:p>
       <w:pPr>
+        <w:jc w:val="right"/>
         <w:rPr>
           <w:rFonts w:ascii="Times New Roman" w:eastAsia="Calibri" w:hAnsi="Times New Roman" w:cs="Times New Roman"/>
           <w:sz w:val="24"/>
           <w:szCs w:val="24"/>
         </w:rPr>
       </w:pPr>
-    </w:p>
-    <w:p>
-      <w:pPr>
+      <w:r>
         <w:rPr>
           <w:rFonts w:ascii="Times New Roman" w:eastAsia="Calibri" w:hAnsi="Times New Roman" w:cs="Times New Roman"/>
           <w:sz w:val="24"/>
           <w:szCs w:val="24"/>
         </w:rPr>
-      </w:pPr>
-    </w:p>
-    <w:p>
-      <w:pPr>
+        <w:t>Выполнил: студент группы БВТ2</w:t>
+      </w:r>
+      <w:r>
         <w:rPr>
           <w:rFonts w:ascii="Times New Roman" w:eastAsia="Calibri" w:hAnsi="Times New Roman" w:cs="Times New Roman"/>
           <w:sz w:val="24"/>
           <w:szCs w:val="24"/>
         </w:rPr>
-      </w:pPr>
+        <w:t>402</w:t>
+      </w:r>
     </w:p>
     <w:p>
       <w:pPr>
@@ -349,21 +390,23 @@
           <w:szCs w:val="24"/>
         </w:rPr>
       </w:pPr>
+      <w:proofErr w:type="spellStart"/>
       <w:r>
         <w:rPr>
           <w:rFonts w:ascii="Times New Roman" w:eastAsia="Calibri" w:hAnsi="Times New Roman" w:cs="Times New Roman"/>
           <w:sz w:val="24"/>
           <w:szCs w:val="24"/>
         </w:rPr>
-        <w:t>Выполнил: студент группы БВТ2</w:t>
-      </w:r>
+        <w:t>Аралушкин</w:t>
+      </w:r>
+      <w:proofErr w:type="spellEnd"/>
       <w:r>
         <w:rPr>
           <w:rFonts w:ascii="Times New Roman" w:eastAsia="Calibri" w:hAnsi="Times New Roman" w:cs="Times New Roman"/>
           <w:sz w:val="24"/>
           <w:szCs w:val="24"/>
         </w:rPr>
-        <w:t>402</w:t>
+        <w:t xml:space="preserve"> Максим Дмитриевич</w:t>
       </w:r>
     </w:p>
     <w:p>
@@ -375,23 +418,23 @@
           <w:szCs w:val="24"/>
         </w:rPr>
       </w:pPr>
-      <w:proofErr w:type="spellStart"/>
-      <w:r>
+    </w:p>
+    <w:p>
+      <w:pPr>
+        <w:jc w:val="right"/>
         <w:rPr>
           <w:rFonts w:ascii="Times New Roman" w:eastAsia="Calibri" w:hAnsi="Times New Roman" w:cs="Times New Roman"/>
           <w:sz w:val="24"/>
           <w:szCs w:val="24"/>
         </w:rPr>
-        <w:t>Аралушкин</w:t>
-      </w:r>
-      <w:proofErr w:type="spellEnd"/>
+      </w:pPr>
       <w:r>
         <w:rPr>
           <w:rFonts w:ascii="Times New Roman" w:eastAsia="Calibri" w:hAnsi="Times New Roman" w:cs="Times New Roman"/>
           <w:sz w:val="24"/>
           <w:szCs w:val="24"/>
         </w:rPr>
-        <w:t xml:space="preserve"> Максим Дмитриевич</w:t>
+        <w:t>Проверил: Тимчук А.В.</w:t>
       </w:r>
     </w:p>
     <w:p>
@@ -413,14 +456,16 @@
           <w:szCs w:val="24"/>
         </w:rPr>
       </w:pPr>
-      <w:r>
+    </w:p>
+    <w:p>
+      <w:pPr>
+        <w:jc w:val="right"/>
         <w:rPr>
           <w:rFonts w:ascii="Times New Roman" w:eastAsia="Calibri" w:hAnsi="Times New Roman" w:cs="Times New Roman"/>
           <w:sz w:val="24"/>
           <w:szCs w:val="24"/>
         </w:rPr>
-        <w:t>Проверил: Тимчук А.В.</w:t>
-      </w:r>
+      </w:pPr>
     </w:p>
     <w:p>
       <w:pPr>
@@ -434,7 +479,6 @@
     </w:p>
     <w:p>
       <w:pPr>
-        <w:jc w:val="right"/>
         <w:rPr>
           <w:rFonts w:ascii="Times New Roman" w:eastAsia="Calibri" w:hAnsi="Times New Roman" w:cs="Times New Roman"/>
           <w:sz w:val="24"/>
@@ -444,56 +488,27 @@
     </w:p>
     <w:p>
       <w:pPr>
-        <w:jc w:val="right"/>
+        <w:jc w:val="center"/>
         <w:rPr>
           <w:rFonts w:ascii="Times New Roman" w:eastAsia="Calibri" w:hAnsi="Times New Roman" w:cs="Times New Roman"/>
           <w:sz w:val="24"/>
           <w:szCs w:val="24"/>
         </w:rPr>
       </w:pPr>
-    </w:p>
-    <w:p>
-      <w:pPr>
-        <w:jc w:val="right"/>
+      <w:r>
         <w:rPr>
           <w:rFonts w:ascii="Times New Roman" w:eastAsia="Calibri" w:hAnsi="Times New Roman" w:cs="Times New Roman"/>
           <w:sz w:val="24"/>
           <w:szCs w:val="24"/>
         </w:rPr>
-      </w:pPr>
-    </w:p>
-    <w:p>
-      <w:pPr>
+        <w:t>Москва, 202</w:t>
+      </w:r>
+      <w:r>
         <w:rPr>
           <w:rFonts w:ascii="Times New Roman" w:eastAsia="Calibri" w:hAnsi="Times New Roman" w:cs="Times New Roman"/>
           <w:sz w:val="24"/>
           <w:szCs w:val="24"/>
         </w:rPr>
-      </w:pPr>
-    </w:p>
-    <w:p>
-      <w:pPr>
-        <w:jc w:val="center"/>
-        <w:rPr>
-          <w:rFonts w:ascii="Times New Roman" w:eastAsia="Calibri" w:hAnsi="Times New Roman" w:cs="Times New Roman"/>
-          <w:sz w:val="24"/>
-          <w:szCs w:val="24"/>
-        </w:rPr>
-      </w:pPr>
-      <w:r>
-        <w:rPr>
-          <w:rFonts w:ascii="Times New Roman" w:eastAsia="Calibri" w:hAnsi="Times New Roman" w:cs="Times New Roman"/>
-          <w:sz w:val="24"/>
-          <w:szCs w:val="24"/>
-        </w:rPr>
-        <w:t>Москва, 202</w:t>
-      </w:r>
-      <w:r>
-        <w:rPr>
-          <w:rFonts w:ascii="Times New Roman" w:eastAsia="Calibri" w:hAnsi="Times New Roman" w:cs="Times New Roman"/>
-          <w:sz w:val="24"/>
-          <w:szCs w:val="24"/>
-        </w:rPr>
         <w:t>6</w:t>
       </w:r>
     </w:p>
@@ -527,7 +542,6 @@
           <w:rFonts w:ascii="Times New Roman" w:hAnsi="Times New Roman" w:cs="Times New Roman"/>
           <w:sz w:val="28"/>
           <w:szCs w:val="28"/>
-          <w:lang w:val="en-US"/>
         </w:rPr>
       </w:pPr>
       <w:r>
@@ -665,7 +679,6 @@
           <w:rFonts w:ascii="Times New Roman" w:hAnsi="Times New Roman" w:cs="Times New Roman"/>
           <w:sz w:val="28"/>
           <w:szCs w:val="28"/>
-          <w:lang w:val="en-US"/>
         </w:rPr>
       </w:pPr>
       <w:r>
@@ -3545,7 +3558,7 @@
           <w:kern w:val="0"/>
           <w:sz w:val="21"/>
           <w:szCs w:val="21"/>
-          <w:lang w:eastAsia="ru-RU"/>
+          <w:lang w:val="en-US" w:eastAsia="ru-RU"/>
           <w14:ligatures w14:val="none"/>
         </w:rPr>
       </w:pPr>
@@ -3561,7 +3574,6 @@
         </w:rPr>
         <w:t xml:space="preserve">    </w:t>
       </w:r>
-      <w:proofErr w:type="spellStart"/>
       <w:r>
         <w:rPr>
           <w:rFonts w:ascii="Consolas" w:eastAsia="Times New Roman" w:hAnsi="Consolas" w:cs="Times New Roman"/>
@@ -3569,20 +3581,19 @@
           <w:kern w:val="0"/>
           <w:sz w:val="21"/>
           <w:szCs w:val="21"/>
-          <w:lang w:eastAsia="ru-RU"/>
+          <w:lang w:val="en-US" w:eastAsia="ru-RU"/>
           <w14:ligatures w14:val="none"/>
         </w:rPr>
         <w:t>assert</w:t>
       </w:r>
-      <w:proofErr w:type="spellEnd"/>
-      <w:r>
-        <w:rPr>
-          <w:rFonts w:ascii="Consolas" w:eastAsia="Times New Roman" w:hAnsi="Consolas" w:cs="Times New Roman"/>
-          <w:color w:val="ABB2BF"/>
-          <w:kern w:val="0"/>
-          <w:sz w:val="21"/>
-          <w:szCs w:val="21"/>
-          <w:lang w:eastAsia="ru-RU"/>
+      <w:r>
+        <w:rPr>
+          <w:rFonts w:ascii="Consolas" w:eastAsia="Times New Roman" w:hAnsi="Consolas" w:cs="Times New Roman"/>
+          <w:color w:val="ABB2BF"/>
+          <w:kern w:val="0"/>
+          <w:sz w:val="21"/>
+          <w:szCs w:val="21"/>
+          <w:lang w:val="en-US" w:eastAsia="ru-RU"/>
           <w14:ligatures w14:val="none"/>
         </w:rPr>
         <w:t xml:space="preserve"> </w:t>
@@ -3596,7 +3607,7 @@
           <w:kern w:val="0"/>
           <w:sz w:val="21"/>
           <w:szCs w:val="21"/>
-          <w:lang w:eastAsia="ru-RU"/>
+          <w:lang w:val="en-US" w:eastAsia="ru-RU"/>
           <w14:ligatures w14:val="none"/>
         </w:rPr>
         <w:t>response.status</w:t>
@@ -3609,7 +3620,7 @@
           <w:kern w:val="0"/>
           <w:sz w:val="21"/>
           <w:szCs w:val="21"/>
-          <w:lang w:eastAsia="ru-RU"/>
+          <w:lang w:val="en-US" w:eastAsia="ru-RU"/>
           <w14:ligatures w14:val="none"/>
         </w:rPr>
         <w:t>_code</w:t>
@@ -3622,7 +3633,7 @@
           <w:kern w:val="0"/>
           <w:sz w:val="21"/>
           <w:szCs w:val="21"/>
-          <w:lang w:eastAsia="ru-RU"/>
+          <w:lang w:val="en-US" w:eastAsia="ru-RU"/>
           <w14:ligatures w14:val="none"/>
         </w:rPr>
         <w:t xml:space="preserve"> </w:t>
@@ -3634,7 +3645,7 @@
           <w:kern w:val="0"/>
           <w:sz w:val="21"/>
           <w:szCs w:val="21"/>
-          <w:lang w:eastAsia="ru-RU"/>
+          <w:lang w:val="en-US" w:eastAsia="ru-RU"/>
           <w14:ligatures w14:val="none"/>
         </w:rPr>
         <w:t>==</w:t>
@@ -3646,7 +3657,7 @@
           <w:kern w:val="0"/>
           <w:sz w:val="21"/>
           <w:szCs w:val="21"/>
-          <w:lang w:eastAsia="ru-RU"/>
+          <w:lang w:val="en-US" w:eastAsia="ru-RU"/>
           <w14:ligatures w14:val="none"/>
         </w:rPr>
         <w:t xml:space="preserve"> </w:t>
@@ -3658,7 +3669,7 @@
           <w:kern w:val="0"/>
           <w:sz w:val="21"/>
           <w:szCs w:val="21"/>
-          <w:lang w:eastAsia="ru-RU"/>
+          <w:lang w:val="en-US" w:eastAsia="ru-RU"/>
           <w14:ligatures w14:val="none"/>
         </w:rPr>
         <w:t>204</w:t>
@@ -3670,24 +3681,27 @@
           <w:rFonts w:ascii="Times New Roman" w:hAnsi="Times New Roman" w:cs="Times New Roman"/>
           <w:sz w:val="28"/>
           <w:szCs w:val="28"/>
-        </w:rPr>
-      </w:pPr>
-    </w:p>
-    <w:p>
-      <w:pPr>
-        <w:rPr>
-          <w:rFonts w:ascii="Times New Roman" w:hAnsi="Times New Roman" w:cs="Times New Roman"/>
-          <w:sz w:val="28"/>
-          <w:szCs w:val="28"/>
-        </w:rPr>
-      </w:pPr>
-    </w:p>
-    <w:p>
-      <w:pPr>
-        <w:rPr>
-          <w:rFonts w:ascii="Times New Roman" w:hAnsi="Times New Roman" w:cs="Times New Roman"/>
-          <w:sz w:val="28"/>
-          <w:szCs w:val="28"/>
+          <w:lang w:val="en-US"/>
+        </w:rPr>
+      </w:pPr>
+    </w:p>
+    <w:p>
+      <w:pPr>
+        <w:rPr>
+          <w:rFonts w:ascii="Times New Roman" w:hAnsi="Times New Roman" w:cs="Times New Roman"/>
+          <w:sz w:val="28"/>
+          <w:szCs w:val="28"/>
+          <w:lang w:val="en-US"/>
+        </w:rPr>
+      </w:pPr>
+    </w:p>
+    <w:p>
+      <w:pPr>
+        <w:rPr>
+          <w:rFonts w:ascii="Times New Roman" w:hAnsi="Times New Roman" w:cs="Times New Roman"/>
+          <w:sz w:val="28"/>
+          <w:szCs w:val="28"/>
+          <w:lang w:val="en-US"/>
         </w:rPr>
       </w:pPr>
     </w:p>
@@ -3699,6 +3713,7 @@
           <w:bCs/>
           <w:sz w:val="28"/>
           <w:szCs w:val="28"/>
+          <w:lang w:val="en-US"/>
         </w:rPr>
       </w:pPr>
       <w:r>
@@ -3710,7 +3725,18 @@
           <w:szCs w:val="28"/>
         </w:rPr>
         <w:lastRenderedPageBreak/>
-        <w:t>Задание №3:</w:t>
+        <w:t>Задание</w:t>
+      </w:r>
+      <w:r>
+        <w:rPr>
+          <w:rFonts w:ascii="Times New Roman" w:hAnsi="Times New Roman" w:cs="Times New Roman"/>
+          <w:b/>
+          <w:bCs/>
+          <w:sz w:val="28"/>
+          <w:szCs w:val="28"/>
+          <w:lang w:val="en-US"/>
+        </w:rPr>
+        <w:t xml:space="preserve"> №3:</w:t>
       </w:r>
     </w:p>
     <w:p>
@@ -4027,30 +4053,6 @@
           <w14:ligatures w14:val="none"/>
         </w:rPr>
       </w:pPr>
-      <w:r>
-        <w:rPr>
-          <w:rFonts w:ascii="Consolas" w:eastAsia="Times New Roman" w:hAnsi="Consolas" w:cs="Times New Roman"/>
-          <w:color w:val="ABB2BF"/>
-          <w:kern w:val="0"/>
-          <w:sz w:val="21"/>
-          <w:szCs w:val="21"/>
-          <w:lang w:val="en-US" w:eastAsia="ru-RU"/>
-          <w14:ligatures w14:val="none"/>
-        </w:rPr>
-        <w:t xml:space="preserve">        - </w:t>
-      </w:r>
-      <w:r>
-        <w:rPr>
-          <w:rFonts w:ascii="Consolas" w:eastAsia="Times New Roman" w:hAnsi="Consolas" w:cs="Times New Roman"/>
-          <w:color w:val="98C379"/>
-          <w:kern w:val="0"/>
-          <w:sz w:val="21"/>
-          <w:szCs w:val="21"/>
-          <w:lang w:val="en-US" w:eastAsia="ru-RU"/>
-          <w14:ligatures w14:val="none"/>
-        </w:rPr>
-        <w:t>'**'</w:t>
-      </w:r>
     </w:p>
     <w:p>
       <w:pPr>
@@ -4066,6 +4068,30 @@
           <w14:ligatures w14:val="none"/>
         </w:rPr>
       </w:pPr>
+      <w:r>
+        <w:rPr>
+          <w:rFonts w:ascii="Consolas" w:eastAsia="Times New Roman" w:hAnsi="Consolas" w:cs="Times New Roman"/>
+          <w:color w:val="E06C75"/>
+          <w:kern w:val="0"/>
+          <w:sz w:val="21"/>
+          <w:szCs w:val="21"/>
+          <w:lang w:val="en-US" w:eastAsia="ru-RU"/>
+          <w14:ligatures w14:val="none"/>
+        </w:rPr>
+        <w:t>jobs</w:t>
+      </w:r>
+      <w:r>
+        <w:rPr>
+          <w:rFonts w:ascii="Consolas" w:eastAsia="Times New Roman" w:hAnsi="Consolas" w:cs="Times New Roman"/>
+          <w:color w:val="ABB2BF"/>
+          <w:kern w:val="0"/>
+          <w:sz w:val="21"/>
+          <w:szCs w:val="21"/>
+          <w:lang w:val="en-US" w:eastAsia="ru-RU"/>
+          <w14:ligatures w14:val="none"/>
+        </w:rPr>
+        <w:t>:</w:t>
+      </w:r>
     </w:p>
     <w:p>
       <w:pPr>
@@ -4084,6 +4110,18 @@
       <w:r>
         <w:rPr>
           <w:rFonts w:ascii="Consolas" w:eastAsia="Times New Roman" w:hAnsi="Consolas" w:cs="Times New Roman"/>
+          <w:color w:val="ABB2BF"/>
+          <w:kern w:val="0"/>
+          <w:sz w:val="21"/>
+          <w:szCs w:val="21"/>
+          <w:lang w:val="en-US" w:eastAsia="ru-RU"/>
+          <w14:ligatures w14:val="none"/>
+        </w:rPr>
+        <w:t xml:space="preserve">  </w:t>
+      </w:r>
+      <w:r>
+        <w:rPr>
+          <w:rFonts w:ascii="Consolas" w:eastAsia="Times New Roman" w:hAnsi="Consolas" w:cs="Times New Roman"/>
           <w:color w:val="E06C75"/>
           <w:kern w:val="0"/>
           <w:sz w:val="21"/>
@@ -4091,7 +4129,7 @@
           <w:lang w:val="en-US" w:eastAsia="ru-RU"/>
           <w14:ligatures w14:val="none"/>
         </w:rPr>
-        <w:t>env</w:t>
+        <w:t>ci</w:t>
       </w:r>
       <w:r>
         <w:rPr>
@@ -4130,7 +4168,7 @@
           <w:lang w:val="en-US" w:eastAsia="ru-RU"/>
           <w14:ligatures w14:val="none"/>
         </w:rPr>
-        <w:t xml:space="preserve">  </w:t>
+        <w:t xml:space="preserve">    </w:t>
       </w:r>
       <w:r>
         <w:rPr>
@@ -4142,7 +4180,7 @@
           <w:lang w:val="en-US" w:eastAsia="ru-RU"/>
           <w14:ligatures w14:val="none"/>
         </w:rPr>
-        <w:t>FORCE_JAVASCRIPT_ACTIONS_TO_NODE24</w:t>
+        <w:t>runs-on</w:t>
       </w:r>
       <w:r>
         <w:rPr>
@@ -4159,14 +4197,14 @@
       <w:r>
         <w:rPr>
           <w:rFonts w:ascii="Consolas" w:eastAsia="Times New Roman" w:hAnsi="Consolas" w:cs="Times New Roman"/>
-          <w:color w:val="D19A66"/>
-          <w:kern w:val="0"/>
-          <w:sz w:val="21"/>
-          <w:szCs w:val="21"/>
-          <w:lang w:val="en-US" w:eastAsia="ru-RU"/>
-          <w14:ligatures w14:val="none"/>
-        </w:rPr>
-        <w:t>true</w:t>
+          <w:color w:val="98C379"/>
+          <w:kern w:val="0"/>
+          <w:sz w:val="21"/>
+          <w:szCs w:val="21"/>
+          <w:lang w:val="en-US" w:eastAsia="ru-RU"/>
+          <w14:ligatures w14:val="none"/>
+        </w:rPr>
+        <w:t>ubuntu-latest</w:t>
       </w:r>
     </w:p>
     <w:p>
@@ -4183,132 +4221,6 @@
           <w14:ligatures w14:val="none"/>
         </w:rPr>
       </w:pPr>
-      <w:r>
-        <w:rPr>
-          <w:rFonts w:ascii="Consolas" w:eastAsia="Times New Roman" w:hAnsi="Consolas" w:cs="Times New Roman"/>
-          <w:color w:val="ABB2BF"/>
-          <w:kern w:val="0"/>
-          <w:sz w:val="21"/>
-          <w:szCs w:val="21"/>
-          <w:lang w:val="en-US" w:eastAsia="ru-RU"/>
-          <w14:ligatures w14:val="none"/>
-        </w:rPr>
-        <w:t xml:space="preserve">  </w:t>
-      </w:r>
-      <w:r>
-        <w:rPr>
-          <w:rFonts w:ascii="Consolas" w:eastAsia="Times New Roman" w:hAnsi="Consolas" w:cs="Times New Roman"/>
-          <w:color w:val="E06C75"/>
-          <w:kern w:val="0"/>
-          <w:sz w:val="21"/>
-          <w:szCs w:val="21"/>
-          <w:lang w:val="en-US" w:eastAsia="ru-RU"/>
-          <w14:ligatures w14:val="none"/>
-        </w:rPr>
-        <w:t>PYTHONPATH</w:t>
-      </w:r>
-      <w:r>
-        <w:rPr>
-          <w:rFonts w:ascii="Consolas" w:eastAsia="Times New Roman" w:hAnsi="Consolas" w:cs="Times New Roman"/>
-          <w:color w:val="ABB2BF"/>
-          <w:kern w:val="0"/>
-          <w:sz w:val="21"/>
-          <w:szCs w:val="21"/>
-          <w:lang w:val="en-US" w:eastAsia="ru-RU"/>
-          <w14:ligatures w14:val="none"/>
-        </w:rPr>
-        <w:t xml:space="preserve">: </w:t>
-      </w:r>
-      <w:r>
-        <w:rPr>
-          <w:rFonts w:ascii="Consolas" w:eastAsia="Times New Roman" w:hAnsi="Consolas" w:cs="Times New Roman"/>
-          <w:color w:val="98C379"/>
-          <w:kern w:val="0"/>
-          <w:sz w:val="21"/>
-          <w:szCs w:val="21"/>
-          <w:lang w:val="en-US" w:eastAsia="ru-RU"/>
-          <w14:ligatures w14:val="none"/>
-        </w:rPr>
-        <w:t>$</w:t>
-      </w:r>
-      <w:proofErr w:type="gramStart"/>
-      <w:r>
-        <w:rPr>
-          <w:rFonts w:ascii="Consolas" w:eastAsia="Times New Roman" w:hAnsi="Consolas" w:cs="Times New Roman"/>
-          <w:color w:val="98C379"/>
-          <w:kern w:val="0"/>
-          <w:sz w:val="21"/>
-          <w:szCs w:val="21"/>
-          <w:lang w:val="en-US" w:eastAsia="ru-RU"/>
-          <w14:ligatures w14:val="none"/>
-        </w:rPr>
-        <w:t xml:space="preserve">{{ </w:t>
-      </w:r>
-      <w:proofErr w:type="spellStart"/>
-      <w:r>
-        <w:rPr>
-          <w:rFonts w:ascii="Consolas" w:eastAsia="Times New Roman" w:hAnsi="Consolas" w:cs="Times New Roman"/>
-          <w:color w:val="98C379"/>
-          <w:kern w:val="0"/>
-          <w:sz w:val="21"/>
-          <w:szCs w:val="21"/>
-          <w:lang w:val="en-US" w:eastAsia="ru-RU"/>
-          <w14:ligatures w14:val="none"/>
-        </w:rPr>
-        <w:t>github</w:t>
-      </w:r>
-      <w:proofErr w:type="gramEnd"/>
-      <w:r>
-        <w:rPr>
-          <w:rFonts w:ascii="Consolas" w:eastAsia="Times New Roman" w:hAnsi="Consolas" w:cs="Times New Roman"/>
-          <w:color w:val="98C379"/>
-          <w:kern w:val="0"/>
-          <w:sz w:val="21"/>
-          <w:szCs w:val="21"/>
-          <w:lang w:val="en-US" w:eastAsia="ru-RU"/>
-          <w14:ligatures w14:val="none"/>
-        </w:rPr>
-        <w:t>.</w:t>
-      </w:r>
-      <w:proofErr w:type="gramStart"/>
-      <w:r>
-        <w:rPr>
-          <w:rFonts w:ascii="Consolas" w:eastAsia="Times New Roman" w:hAnsi="Consolas" w:cs="Times New Roman"/>
-          <w:color w:val="98C379"/>
-          <w:kern w:val="0"/>
-          <w:sz w:val="21"/>
-          <w:szCs w:val="21"/>
-          <w:lang w:val="en-US" w:eastAsia="ru-RU"/>
-          <w14:ligatures w14:val="none"/>
-        </w:rPr>
-        <w:t>workspace</w:t>
-      </w:r>
-      <w:proofErr w:type="spellEnd"/>
-      <w:r>
-        <w:rPr>
-          <w:rFonts w:ascii="Consolas" w:eastAsia="Times New Roman" w:hAnsi="Consolas" w:cs="Times New Roman"/>
-          <w:color w:val="98C379"/>
-          <w:kern w:val="0"/>
-          <w:sz w:val="21"/>
-          <w:szCs w:val="21"/>
-          <w:lang w:val="en-US" w:eastAsia="ru-RU"/>
-          <w14:ligatures w14:val="none"/>
-        </w:rPr>
-        <w:t xml:space="preserve"> }</w:t>
-      </w:r>
-      <w:proofErr w:type="gramEnd"/>
-      <w:r>
-        <w:rPr>
-          <w:rFonts w:ascii="Consolas" w:eastAsia="Times New Roman" w:hAnsi="Consolas" w:cs="Times New Roman"/>
-          <w:color w:val="98C379"/>
-          <w:kern w:val="0"/>
-          <w:sz w:val="21"/>
-          <w:szCs w:val="21"/>
-          <w:lang w:val="en-US" w:eastAsia="ru-RU"/>
-          <w14:ligatures w14:val="none"/>
-        </w:rPr>
-        <w:t>}</w:t>
-      </w:r>
     </w:p>
     <w:p>
       <w:pPr>
@@ -4324,6 +4236,42 @@
           <w14:ligatures w14:val="none"/>
         </w:rPr>
       </w:pPr>
+      <w:r>
+        <w:rPr>
+          <w:rFonts w:ascii="Consolas" w:eastAsia="Times New Roman" w:hAnsi="Consolas" w:cs="Times New Roman"/>
+          <w:color w:val="ABB2BF"/>
+          <w:kern w:val="0"/>
+          <w:sz w:val="21"/>
+          <w:szCs w:val="21"/>
+          <w:lang w:val="en-US" w:eastAsia="ru-RU"/>
+          <w14:ligatures w14:val="none"/>
+        </w:rPr>
+        <w:t xml:space="preserve">    </w:t>
+      </w:r>
+      <w:r>
+        <w:rPr>
+          <w:rFonts w:ascii="Consolas" w:eastAsia="Times New Roman" w:hAnsi="Consolas" w:cs="Times New Roman"/>
+          <w:color w:val="E06C75"/>
+          <w:kern w:val="0"/>
+          <w:sz w:val="21"/>
+          <w:szCs w:val="21"/>
+          <w:lang w:val="en-US" w:eastAsia="ru-RU"/>
+          <w14:ligatures w14:val="none"/>
+        </w:rPr>
+        <w:t>steps</w:t>
+      </w:r>
+      <w:r>
+        <w:rPr>
+          <w:rFonts w:ascii="Consolas" w:eastAsia="Times New Roman" w:hAnsi="Consolas" w:cs="Times New Roman"/>
+          <w:color w:val="ABB2BF"/>
+          <w:kern w:val="0"/>
+          <w:sz w:val="21"/>
+          <w:szCs w:val="21"/>
+          <w:lang w:val="en-US" w:eastAsia="ru-RU"/>
+          <w14:ligatures w14:val="none"/>
+        </w:rPr>
+        <w:t>:</w:t>
+      </w:r>
     </w:p>
     <w:p>
       <w:pPr>
@@ -4342,6 +4290,18 @@
       <w:r>
         <w:rPr>
           <w:rFonts w:ascii="Consolas" w:eastAsia="Times New Roman" w:hAnsi="Consolas" w:cs="Times New Roman"/>
+          <w:color w:val="ABB2BF"/>
+          <w:kern w:val="0"/>
+          <w:sz w:val="21"/>
+          <w:szCs w:val="21"/>
+          <w:lang w:val="en-US" w:eastAsia="ru-RU"/>
+          <w14:ligatures w14:val="none"/>
+        </w:rPr>
+        <w:t xml:space="preserve">    - </w:t>
+      </w:r>
+      <w:r>
+        <w:rPr>
+          <w:rFonts w:ascii="Consolas" w:eastAsia="Times New Roman" w:hAnsi="Consolas" w:cs="Times New Roman"/>
           <w:color w:val="E06C75"/>
           <w:kern w:val="0"/>
           <w:sz w:val="21"/>
@@ -4349,19 +4309,31 @@
           <w:lang w:val="en-US" w:eastAsia="ru-RU"/>
           <w14:ligatures w14:val="none"/>
         </w:rPr>
-        <w:t>jobs</w:t>
-      </w:r>
-      <w:r>
-        <w:rPr>
-          <w:rFonts w:ascii="Consolas" w:eastAsia="Times New Roman" w:hAnsi="Consolas" w:cs="Times New Roman"/>
-          <w:color w:val="ABB2BF"/>
-          <w:kern w:val="0"/>
-          <w:sz w:val="21"/>
-          <w:szCs w:val="21"/>
-          <w:lang w:val="en-US" w:eastAsia="ru-RU"/>
-          <w14:ligatures w14:val="none"/>
-        </w:rPr>
-        <w:t>:</w:t>
+        <w:t>uses</w:t>
+      </w:r>
+      <w:r>
+        <w:rPr>
+          <w:rFonts w:ascii="Consolas" w:eastAsia="Times New Roman" w:hAnsi="Consolas" w:cs="Times New Roman"/>
+          <w:color w:val="ABB2BF"/>
+          <w:kern w:val="0"/>
+          <w:sz w:val="21"/>
+          <w:szCs w:val="21"/>
+          <w:lang w:val="en-US" w:eastAsia="ru-RU"/>
+          <w14:ligatures w14:val="none"/>
+        </w:rPr>
+        <w:t xml:space="preserve">: </w:t>
+      </w:r>
+      <w:r>
+        <w:rPr>
+          <w:rFonts w:ascii="Consolas" w:eastAsia="Times New Roman" w:hAnsi="Consolas" w:cs="Times New Roman"/>
+          <w:color w:val="98C379"/>
+          <w:kern w:val="0"/>
+          <w:sz w:val="21"/>
+          <w:szCs w:val="21"/>
+          <w:lang w:val="en-US" w:eastAsia="ru-RU"/>
+          <w14:ligatures w14:val="none"/>
+        </w:rPr>
+        <w:t>actions/checkout@v4</w:t>
       </w:r>
     </w:p>
     <w:p>
@@ -4388,7 +4360,7 @@
           <w:lang w:val="en-US" w:eastAsia="ru-RU"/>
           <w14:ligatures w14:val="none"/>
         </w:rPr>
-        <w:t xml:space="preserve">  </w:t>
+        <w:t xml:space="preserve">    - </w:t>
       </w:r>
       <w:r>
         <w:rPr>
@@ -4400,19 +4372,31 @@
           <w:lang w:val="en-US" w:eastAsia="ru-RU"/>
           <w14:ligatures w14:val="none"/>
         </w:rPr>
-        <w:t>ci</w:t>
-      </w:r>
-      <w:r>
-        <w:rPr>
-          <w:rFonts w:ascii="Consolas" w:eastAsia="Times New Roman" w:hAnsi="Consolas" w:cs="Times New Roman"/>
-          <w:color w:val="ABB2BF"/>
-          <w:kern w:val="0"/>
-          <w:sz w:val="21"/>
-          <w:szCs w:val="21"/>
-          <w:lang w:val="en-US" w:eastAsia="ru-RU"/>
-          <w14:ligatures w14:val="none"/>
-        </w:rPr>
-        <w:t>:</w:t>
+        <w:t>name</w:t>
+      </w:r>
+      <w:r>
+        <w:rPr>
+          <w:rFonts w:ascii="Consolas" w:eastAsia="Times New Roman" w:hAnsi="Consolas" w:cs="Times New Roman"/>
+          <w:color w:val="ABB2BF"/>
+          <w:kern w:val="0"/>
+          <w:sz w:val="21"/>
+          <w:szCs w:val="21"/>
+          <w:lang w:val="en-US" w:eastAsia="ru-RU"/>
+          <w14:ligatures w14:val="none"/>
+        </w:rPr>
+        <w:t xml:space="preserve">: </w:t>
+      </w:r>
+      <w:r>
+        <w:rPr>
+          <w:rFonts w:ascii="Consolas" w:eastAsia="Times New Roman" w:hAnsi="Consolas" w:cs="Times New Roman"/>
+          <w:color w:val="98C379"/>
+          <w:kern w:val="0"/>
+          <w:sz w:val="21"/>
+          <w:szCs w:val="21"/>
+          <w:lang w:val="en-US" w:eastAsia="ru-RU"/>
+          <w14:ligatures w14:val="none"/>
+        </w:rPr>
+        <w:t>Set up Python 3.12</w:t>
       </w:r>
     </w:p>
     <w:p>
@@ -4439,7 +4423,7 @@
           <w:lang w:val="en-US" w:eastAsia="ru-RU"/>
           <w14:ligatures w14:val="none"/>
         </w:rPr>
-        <w:t xml:space="preserve">    </w:t>
+        <w:t xml:space="preserve">      </w:t>
       </w:r>
       <w:r>
         <w:rPr>
@@ -4451,7 +4435,7 @@
           <w:lang w:val="en-US" w:eastAsia="ru-RU"/>
           <w14:ligatures w14:val="none"/>
         </w:rPr>
-        <w:t>runs-on</w:t>
+        <w:t>uses</w:t>
       </w:r>
       <w:r>
         <w:rPr>
@@ -4475,7 +4459,7 @@
           <w:lang w:val="en-US" w:eastAsia="ru-RU"/>
           <w14:ligatures w14:val="none"/>
         </w:rPr>
-        <w:t>ubuntu-latest</w:t>
+        <w:t>actions/setup-python@v5</w:t>
       </w:r>
     </w:p>
     <w:p>
@@ -4492,6 +4476,42 @@
           <w14:ligatures w14:val="none"/>
         </w:rPr>
       </w:pPr>
+      <w:r>
+        <w:rPr>
+          <w:rFonts w:ascii="Consolas" w:eastAsia="Times New Roman" w:hAnsi="Consolas" w:cs="Times New Roman"/>
+          <w:color w:val="ABB2BF"/>
+          <w:kern w:val="0"/>
+          <w:sz w:val="21"/>
+          <w:szCs w:val="21"/>
+          <w:lang w:val="en-US" w:eastAsia="ru-RU"/>
+          <w14:ligatures w14:val="none"/>
+        </w:rPr>
+        <w:t xml:space="preserve">      </w:t>
+      </w:r>
+      <w:r>
+        <w:rPr>
+          <w:rFonts w:ascii="Consolas" w:eastAsia="Times New Roman" w:hAnsi="Consolas" w:cs="Times New Roman"/>
+          <w:color w:val="E06C75"/>
+          <w:kern w:val="0"/>
+          <w:sz w:val="21"/>
+          <w:szCs w:val="21"/>
+          <w:lang w:val="en-US" w:eastAsia="ru-RU"/>
+          <w14:ligatures w14:val="none"/>
+        </w:rPr>
+        <w:t>with</w:t>
+      </w:r>
+      <w:r>
+        <w:rPr>
+          <w:rFonts w:ascii="Consolas" w:eastAsia="Times New Roman" w:hAnsi="Consolas" w:cs="Times New Roman"/>
+          <w:color w:val="ABB2BF"/>
+          <w:kern w:val="0"/>
+          <w:sz w:val="21"/>
+          <w:szCs w:val="21"/>
+          <w:lang w:val="en-US" w:eastAsia="ru-RU"/>
+          <w14:ligatures w14:val="none"/>
+        </w:rPr>
+        <w:t>:</w:t>
+      </w:r>
     </w:p>
     <w:p>
       <w:pPr>
@@ -4517,7 +4537,7 @@
           <w:lang w:val="en-US" w:eastAsia="ru-RU"/>
           <w14:ligatures w14:val="none"/>
         </w:rPr>
-        <w:t xml:space="preserve">    </w:t>
+        <w:t xml:space="preserve">        </w:t>
       </w:r>
       <w:r>
         <w:rPr>
@@ -4529,19 +4549,31 @@
           <w:lang w:val="en-US" w:eastAsia="ru-RU"/>
           <w14:ligatures w14:val="none"/>
         </w:rPr>
-        <w:t>steps</w:t>
-      </w:r>
-      <w:r>
-        <w:rPr>
-          <w:rFonts w:ascii="Consolas" w:eastAsia="Times New Roman" w:hAnsi="Consolas" w:cs="Times New Roman"/>
-          <w:color w:val="ABB2BF"/>
-          <w:kern w:val="0"/>
-          <w:sz w:val="21"/>
-          <w:szCs w:val="21"/>
-          <w:lang w:val="en-US" w:eastAsia="ru-RU"/>
-          <w14:ligatures w14:val="none"/>
-        </w:rPr>
-        <w:t>:</w:t>
+        <w:t>python-version</w:t>
+      </w:r>
+      <w:r>
+        <w:rPr>
+          <w:rFonts w:ascii="Consolas" w:eastAsia="Times New Roman" w:hAnsi="Consolas" w:cs="Times New Roman"/>
+          <w:color w:val="ABB2BF"/>
+          <w:kern w:val="0"/>
+          <w:sz w:val="21"/>
+          <w:szCs w:val="21"/>
+          <w:lang w:val="en-US" w:eastAsia="ru-RU"/>
+          <w14:ligatures w14:val="none"/>
+        </w:rPr>
+        <w:t xml:space="preserve">: </w:t>
+      </w:r>
+      <w:r>
+        <w:rPr>
+          <w:rFonts w:ascii="Consolas" w:eastAsia="Times New Roman" w:hAnsi="Consolas" w:cs="Times New Roman"/>
+          <w:color w:val="D19A66"/>
+          <w:kern w:val="0"/>
+          <w:sz w:val="21"/>
+          <w:szCs w:val="21"/>
+          <w:lang w:val="en-US" w:eastAsia="ru-RU"/>
+          <w14:ligatures w14:val="none"/>
+        </w:rPr>
+        <w:t>3.12</w:t>
       </w:r>
     </w:p>
     <w:p>
@@ -4580,7 +4612,7 @@
           <w:lang w:val="en-US" w:eastAsia="ru-RU"/>
           <w14:ligatures w14:val="none"/>
         </w:rPr>
-        <w:t>uses</w:t>
+        <w:t>name</w:t>
       </w:r>
       <w:r>
         <w:rPr>
@@ -4604,7 +4636,7 @@
           <w:lang w:val="en-US" w:eastAsia="ru-RU"/>
           <w14:ligatures w14:val="none"/>
         </w:rPr>
-        <w:t>actions/checkout@v4</w:t>
+        <w:t>Install dependencies</w:t>
       </w:r>
     </w:p>
     <w:p>
@@ -4631,7 +4663,7 @@
           <w:lang w:val="en-US" w:eastAsia="ru-RU"/>
           <w14:ligatures w14:val="none"/>
         </w:rPr>
-        <w:t xml:space="preserve">    - </w:t>
+        <w:t xml:space="preserve">      </w:t>
       </w:r>
       <w:r>
         <w:rPr>
@@ -4643,7 +4675,7 @@
           <w:lang w:val="en-US" w:eastAsia="ru-RU"/>
           <w14:ligatures w14:val="none"/>
         </w:rPr>
-        <w:t>name</w:t>
+        <w:t>run</w:t>
       </w:r>
       <w:r>
         <w:rPr>
@@ -4660,14 +4692,14 @@
       <w:r>
         <w:rPr>
           <w:rFonts w:ascii="Consolas" w:eastAsia="Times New Roman" w:hAnsi="Consolas" w:cs="Times New Roman"/>
-          <w:color w:val="98C379"/>
-          <w:kern w:val="0"/>
-          <w:sz w:val="21"/>
-          <w:szCs w:val="21"/>
-          <w:lang w:val="en-US" w:eastAsia="ru-RU"/>
-          <w14:ligatures w14:val="none"/>
-        </w:rPr>
-        <w:t>Set up Python 3.12</w:t>
+          <w:color w:val="C678DD"/>
+          <w:kern w:val="0"/>
+          <w:sz w:val="21"/>
+          <w:szCs w:val="21"/>
+          <w:lang w:val="en-US" w:eastAsia="ru-RU"/>
+          <w14:ligatures w14:val="none"/>
+        </w:rPr>
+        <w:t>|</w:t>
       </w:r>
     </w:p>
     <w:p>
@@ -4694,43 +4726,19 @@
           <w:lang w:val="en-US" w:eastAsia="ru-RU"/>
           <w14:ligatures w14:val="none"/>
         </w:rPr>
-        <w:t xml:space="preserve">      </w:t>
-      </w:r>
-      <w:r>
-        <w:rPr>
-          <w:rFonts w:ascii="Consolas" w:eastAsia="Times New Roman" w:hAnsi="Consolas" w:cs="Times New Roman"/>
-          <w:color w:val="E06C75"/>
-          <w:kern w:val="0"/>
-          <w:sz w:val="21"/>
-          <w:szCs w:val="21"/>
-          <w:lang w:val="en-US" w:eastAsia="ru-RU"/>
-          <w14:ligatures w14:val="none"/>
-        </w:rPr>
-        <w:t>uses</w:t>
-      </w:r>
-      <w:r>
-        <w:rPr>
-          <w:rFonts w:ascii="Consolas" w:eastAsia="Times New Roman" w:hAnsi="Consolas" w:cs="Times New Roman"/>
-          <w:color w:val="ABB2BF"/>
-          <w:kern w:val="0"/>
-          <w:sz w:val="21"/>
-          <w:szCs w:val="21"/>
-          <w:lang w:val="en-US" w:eastAsia="ru-RU"/>
-          <w14:ligatures w14:val="none"/>
-        </w:rPr>
-        <w:t xml:space="preserve">: </w:t>
-      </w:r>
-      <w:r>
-        <w:rPr>
-          <w:rFonts w:ascii="Consolas" w:eastAsia="Times New Roman" w:hAnsi="Consolas" w:cs="Times New Roman"/>
-          <w:color w:val="98C379"/>
-          <w:kern w:val="0"/>
-          <w:sz w:val="21"/>
-          <w:szCs w:val="21"/>
-          <w:lang w:val="en-US" w:eastAsia="ru-RU"/>
-          <w14:ligatures w14:val="none"/>
-        </w:rPr>
-        <w:t>actions/setup-python@v5</w:t>
+        <w:t xml:space="preserve">        </w:t>
+      </w:r>
+      <w:r>
+        <w:rPr>
+          <w:rFonts w:ascii="Consolas" w:eastAsia="Times New Roman" w:hAnsi="Consolas" w:cs="Times New Roman"/>
+          <w:color w:val="98C379"/>
+          <w:kern w:val="0"/>
+          <w:sz w:val="21"/>
+          <w:szCs w:val="21"/>
+          <w:lang w:val="en-US" w:eastAsia="ru-RU"/>
+          <w14:ligatures w14:val="none"/>
+        </w:rPr>
+        <w:t>python -m pip install --upgrade pip</w:t>
       </w:r>
     </w:p>
     <w:p>
@@ -4762,26 +4770,14 @@
       <w:r>
         <w:rPr>
           <w:rFonts w:ascii="Consolas" w:eastAsia="Times New Roman" w:hAnsi="Consolas" w:cs="Times New Roman"/>
-          <w:color w:val="E06C75"/>
-          <w:kern w:val="0"/>
-          <w:sz w:val="21"/>
-          <w:szCs w:val="21"/>
-          <w:lang w:val="en-US" w:eastAsia="ru-RU"/>
-          <w14:ligatures w14:val="none"/>
-        </w:rPr>
-        <w:t>with</w:t>
-      </w:r>
-      <w:r>
-        <w:rPr>
-          <w:rFonts w:ascii="Consolas" w:eastAsia="Times New Roman" w:hAnsi="Consolas" w:cs="Times New Roman"/>
-          <w:color w:val="ABB2BF"/>
-          <w:kern w:val="0"/>
-          <w:sz w:val="21"/>
-          <w:szCs w:val="21"/>
-          <w:lang w:val="en-US" w:eastAsia="ru-RU"/>
-          <w14:ligatures w14:val="none"/>
-        </w:rPr>
-        <w:t>:</w:t>
+          <w:color w:val="98C379"/>
+          <w:kern w:val="0"/>
+          <w:sz w:val="21"/>
+          <w:szCs w:val="21"/>
+          <w:lang w:val="en-US" w:eastAsia="ru-RU"/>
+          <w14:ligatures w14:val="none"/>
+        </w:rPr>
+        <w:t>  pip install -r requirements.txt</w:t>
       </w:r>
     </w:p>
     <w:p>
@@ -4808,7 +4804,7 @@
           <w:lang w:val="en-US" w:eastAsia="ru-RU"/>
           <w14:ligatures w14:val="none"/>
         </w:rPr>
-        <w:t xml:space="preserve">        </w:t>
+        <w:t xml:space="preserve">    - </w:t>
       </w:r>
       <w:r>
         <w:rPr>
@@ -4820,7 +4816,7 @@
           <w:lang w:val="en-US" w:eastAsia="ru-RU"/>
           <w14:ligatures w14:val="none"/>
         </w:rPr>
-        <w:t>python-version</w:t>
+        <w:t>name</w:t>
       </w:r>
       <w:r>
         <w:rPr>
@@ -4837,14 +4833,14 @@
       <w:r>
         <w:rPr>
           <w:rFonts w:ascii="Consolas" w:eastAsia="Times New Roman" w:hAnsi="Consolas" w:cs="Times New Roman"/>
-          <w:color w:val="D19A66"/>
-          <w:kern w:val="0"/>
-          <w:sz w:val="21"/>
-          <w:szCs w:val="21"/>
-          <w:lang w:val="en-US" w:eastAsia="ru-RU"/>
-          <w14:ligatures w14:val="none"/>
-        </w:rPr>
-        <w:t>3.12</w:t>
+          <w:color w:val="98C379"/>
+          <w:kern w:val="0"/>
+          <w:sz w:val="21"/>
+          <w:szCs w:val="21"/>
+          <w:lang w:val="en-US" w:eastAsia="ru-RU"/>
+          <w14:ligatures w14:val="none"/>
+        </w:rPr>
+        <w:t>Run tests</w:t>
       </w:r>
     </w:p>
     <w:p>
@@ -4871,7 +4867,7 @@
           <w:lang w:val="en-US" w:eastAsia="ru-RU"/>
           <w14:ligatures w14:val="none"/>
         </w:rPr>
-        <w:t xml:space="preserve">    - </w:t>
+        <w:t xml:space="preserve">      </w:t>
       </w:r>
       <w:r>
         <w:rPr>
@@ -4883,7 +4879,7 @@
           <w:lang w:val="en-US" w:eastAsia="ru-RU"/>
           <w14:ligatures w14:val="none"/>
         </w:rPr>
-        <w:t>name</w:t>
+        <w:t>run</w:t>
       </w:r>
       <w:r>
         <w:rPr>
@@ -4907,8 +4903,44 @@
           <w:lang w:val="en-US" w:eastAsia="ru-RU"/>
           <w14:ligatures w14:val="none"/>
         </w:rPr>
-        <w:t>Install dependencies</w:t>
-      </w:r>
+        <w:t xml:space="preserve">python -m </w:t>
+      </w:r>
+      <w:proofErr w:type="spellStart"/>
+      <w:r>
+        <w:rPr>
+          <w:rFonts w:ascii="Consolas" w:eastAsia="Times New Roman" w:hAnsi="Consolas" w:cs="Times New Roman"/>
+          <w:color w:val="98C379"/>
+          <w:kern w:val="0"/>
+          <w:sz w:val="21"/>
+          <w:szCs w:val="21"/>
+          <w:lang w:val="en-US" w:eastAsia="ru-RU"/>
+          <w14:ligatures w14:val="none"/>
+        </w:rPr>
+        <w:t>pytest</w:t>
+      </w:r>
+      <w:proofErr w:type="spellEnd"/>
+      <w:r>
+        <w:rPr>
+          <w:rFonts w:ascii="Consolas" w:eastAsia="Times New Roman" w:hAnsi="Consolas" w:cs="Times New Roman"/>
+          <w:color w:val="98C379"/>
+          <w:kern w:val="0"/>
+          <w:sz w:val="21"/>
+          <w:szCs w:val="21"/>
+          <w:lang w:val="en-US" w:eastAsia="ru-RU"/>
+          <w14:ligatures w14:val="none"/>
+        </w:rPr>
+        <w:t xml:space="preserve"> tests/</w:t>
+      </w:r>
+    </w:p>
+    <w:p>
+      <w:pPr>
+        <w:rPr>
+          <w:rFonts w:ascii="Times New Roman" w:hAnsi="Times New Roman" w:cs="Times New Roman"/>
+          <w:sz w:val="28"/>
+          <w:szCs w:val="28"/>
+          <w:lang w:val="en-US"/>
+        </w:rPr>
+      </w:pPr>
     </w:p>
     <w:p>
       <w:pPr>
@@ -4927,18 +4959,6 @@
       <w:r>
         <w:rPr>
           <w:rFonts w:ascii="Consolas" w:eastAsia="Times New Roman" w:hAnsi="Consolas" w:cs="Times New Roman"/>
-          <w:color w:val="ABB2BF"/>
-          <w:kern w:val="0"/>
-          <w:sz w:val="21"/>
-          <w:szCs w:val="21"/>
-          <w:lang w:val="en-US" w:eastAsia="ru-RU"/>
-          <w14:ligatures w14:val="none"/>
-        </w:rPr>
-        <w:t xml:space="preserve">      </w:t>
-      </w:r>
-      <w:r>
-        <w:rPr>
-          <w:rFonts w:ascii="Consolas" w:eastAsia="Times New Roman" w:hAnsi="Consolas" w:cs="Times New Roman"/>
           <w:color w:val="E06C75"/>
           <w:kern w:val="0"/>
           <w:sz w:val="21"/>
@@ -4946,7 +4966,7 @@
           <w:lang w:val="en-US" w:eastAsia="ru-RU"/>
           <w14:ligatures w14:val="none"/>
         </w:rPr>
-        <w:t>run</w:t>
+        <w:t>name</w:t>
       </w:r>
       <w:r>
         <w:rPr>
@@ -4963,14 +4983,14 @@
       <w:r>
         <w:rPr>
           <w:rFonts w:ascii="Consolas" w:eastAsia="Times New Roman" w:hAnsi="Consolas" w:cs="Times New Roman"/>
-          <w:color w:val="C678DD"/>
-          <w:kern w:val="0"/>
-          <w:sz w:val="21"/>
-          <w:szCs w:val="21"/>
-          <w:lang w:val="en-US" w:eastAsia="ru-RU"/>
-          <w14:ligatures w14:val="none"/>
-        </w:rPr>
-        <w:t>|</w:t>
+          <w:color w:val="98C379"/>
+          <w:kern w:val="0"/>
+          <w:sz w:val="21"/>
+          <w:szCs w:val="21"/>
+          <w:lang w:val="en-US" w:eastAsia="ru-RU"/>
+          <w14:ligatures w14:val="none"/>
+        </w:rPr>
+        <w:t>Build and Delivery</w:t>
       </w:r>
     </w:p>
     <w:p>
@@ -4987,30 +5007,6 @@
           <w14:ligatures w14:val="none"/>
         </w:rPr>
       </w:pPr>
-      <w:r>
-        <w:rPr>
-          <w:rFonts w:ascii="Consolas" w:eastAsia="Times New Roman" w:hAnsi="Consolas" w:cs="Times New Roman"/>
-          <w:color w:val="ABB2BF"/>
-          <w:kern w:val="0"/>
-          <w:sz w:val="21"/>
-          <w:szCs w:val="21"/>
-          <w:lang w:val="en-US" w:eastAsia="ru-RU"/>
-          <w14:ligatures w14:val="none"/>
-        </w:rPr>
-        <w:t xml:space="preserve">        </w:t>
-      </w:r>
-      <w:r>
-        <w:rPr>
-          <w:rFonts w:ascii="Consolas" w:eastAsia="Times New Roman" w:hAnsi="Consolas" w:cs="Times New Roman"/>
-          <w:color w:val="98C379"/>
-          <w:kern w:val="0"/>
-          <w:sz w:val="21"/>
-          <w:szCs w:val="21"/>
-          <w:lang w:val="en-US" w:eastAsia="ru-RU"/>
-          <w14:ligatures w14:val="none"/>
-        </w:rPr>
-        <w:t>python -m pip install --upgrade pip</w:t>
-      </w:r>
     </w:p>
     <w:p>
       <w:pPr>
@@ -5029,26 +5025,26 @@
       <w:r>
         <w:rPr>
           <w:rFonts w:ascii="Consolas" w:eastAsia="Times New Roman" w:hAnsi="Consolas" w:cs="Times New Roman"/>
-          <w:color w:val="ABB2BF"/>
-          <w:kern w:val="0"/>
-          <w:sz w:val="21"/>
-          <w:szCs w:val="21"/>
-          <w:lang w:val="en-US" w:eastAsia="ru-RU"/>
-          <w14:ligatures w14:val="none"/>
-        </w:rPr>
-        <w:t xml:space="preserve">      </w:t>
-      </w:r>
-      <w:r>
-        <w:rPr>
-          <w:rFonts w:ascii="Consolas" w:eastAsia="Times New Roman" w:hAnsi="Consolas" w:cs="Times New Roman"/>
-          <w:color w:val="98C379"/>
-          <w:kern w:val="0"/>
-          <w:sz w:val="21"/>
-          <w:szCs w:val="21"/>
-          <w:lang w:val="en-US" w:eastAsia="ru-RU"/>
-          <w14:ligatures w14:val="none"/>
-        </w:rPr>
-        <w:t>  pip install -r requirements.txt</w:t>
+          <w:color w:val="E06C75"/>
+          <w:kern w:val="0"/>
+          <w:sz w:val="21"/>
+          <w:szCs w:val="21"/>
+          <w:lang w:val="en-US" w:eastAsia="ru-RU"/>
+          <w14:ligatures w14:val="none"/>
+        </w:rPr>
+        <w:t>on</w:t>
+      </w:r>
+      <w:r>
+        <w:rPr>
+          <w:rFonts w:ascii="Consolas" w:eastAsia="Times New Roman" w:hAnsi="Consolas" w:cs="Times New Roman"/>
+          <w:color w:val="ABB2BF"/>
+          <w:kern w:val="0"/>
+          <w:sz w:val="21"/>
+          <w:szCs w:val="21"/>
+          <w:lang w:val="en-US" w:eastAsia="ru-RU"/>
+          <w14:ligatures w14:val="none"/>
+        </w:rPr>
+        <w:t>:</w:t>
       </w:r>
     </w:p>
     <w:p>
@@ -5075,8 +5071,9 @@
           <w:lang w:val="en-US" w:eastAsia="ru-RU"/>
           <w14:ligatures w14:val="none"/>
         </w:rPr>
-        <w:t xml:space="preserve">    - </w:t>
-      </w:r>
+        <w:t xml:space="preserve">  </w:t>
+      </w:r>
+      <w:proofErr w:type="spellStart"/>
       <w:r>
         <w:rPr>
           <w:rFonts w:ascii="Consolas" w:eastAsia="Times New Roman" w:hAnsi="Consolas" w:cs="Times New Roman"/>
@@ -5087,31 +5084,20 @@
           <w:lang w:val="en-US" w:eastAsia="ru-RU"/>
           <w14:ligatures w14:val="none"/>
         </w:rPr>
-        <w:t>name</w:t>
-      </w:r>
-      <w:r>
-        <w:rPr>
-          <w:rFonts w:ascii="Consolas" w:eastAsia="Times New Roman" w:hAnsi="Consolas" w:cs="Times New Roman"/>
-          <w:color w:val="ABB2BF"/>
-          <w:kern w:val="0"/>
-          <w:sz w:val="21"/>
-          <w:szCs w:val="21"/>
-          <w:lang w:val="en-US" w:eastAsia="ru-RU"/>
-          <w14:ligatures w14:val="none"/>
-        </w:rPr>
-        <w:t xml:space="preserve">: </w:t>
-      </w:r>
-      <w:r>
-        <w:rPr>
-          <w:rFonts w:ascii="Consolas" w:eastAsia="Times New Roman" w:hAnsi="Consolas" w:cs="Times New Roman"/>
-          <w:color w:val="98C379"/>
-          <w:kern w:val="0"/>
-          <w:sz w:val="21"/>
-          <w:szCs w:val="21"/>
-          <w:lang w:val="en-US" w:eastAsia="ru-RU"/>
-          <w14:ligatures w14:val="none"/>
-        </w:rPr>
-        <w:t>Run tests</w:t>
+        <w:t>workflow_run</w:t>
+      </w:r>
+      <w:proofErr w:type="spellEnd"/>
+      <w:r>
+        <w:rPr>
+          <w:rFonts w:ascii="Consolas" w:eastAsia="Times New Roman" w:hAnsi="Consolas" w:cs="Times New Roman"/>
+          <w:color w:val="ABB2BF"/>
+          <w:kern w:val="0"/>
+          <w:sz w:val="21"/>
+          <w:szCs w:val="21"/>
+          <w:lang w:val="en-US" w:eastAsia="ru-RU"/>
+          <w14:ligatures w14:val="none"/>
+        </w:rPr>
+        <w:t>:</w:t>
       </w:r>
     </w:p>
     <w:p>
@@ -5138,7 +5124,7 @@
           <w:lang w:val="en-US" w:eastAsia="ru-RU"/>
           <w14:ligatures w14:val="none"/>
         </w:rPr>
-        <w:t xml:space="preserve">      </w:t>
+        <w:t xml:space="preserve">    </w:t>
       </w:r>
       <w:r>
         <w:rPr>
@@ -5150,68 +5136,44 @@
           <w:lang w:val="en-US" w:eastAsia="ru-RU"/>
           <w14:ligatures w14:val="none"/>
         </w:rPr>
-        <w:t>run</w:t>
-      </w:r>
-      <w:r>
-        <w:rPr>
-          <w:rFonts w:ascii="Consolas" w:eastAsia="Times New Roman" w:hAnsi="Consolas" w:cs="Times New Roman"/>
-          <w:color w:val="ABB2BF"/>
-          <w:kern w:val="0"/>
-          <w:sz w:val="21"/>
-          <w:szCs w:val="21"/>
-          <w:lang w:val="en-US" w:eastAsia="ru-RU"/>
-          <w14:ligatures w14:val="none"/>
-        </w:rPr>
-        <w:t xml:space="preserve">: </w:t>
-      </w:r>
-      <w:r>
-        <w:rPr>
-          <w:rFonts w:ascii="Consolas" w:eastAsia="Times New Roman" w:hAnsi="Consolas" w:cs="Times New Roman"/>
-          <w:color w:val="98C379"/>
-          <w:kern w:val="0"/>
-          <w:sz w:val="21"/>
-          <w:szCs w:val="21"/>
-          <w:lang w:val="en-US" w:eastAsia="ru-RU"/>
-          <w14:ligatures w14:val="none"/>
-        </w:rPr>
-        <w:t xml:space="preserve">python -m </w:t>
-      </w:r>
-      <w:proofErr w:type="spellStart"/>
-      <w:r>
-        <w:rPr>
-          <w:rFonts w:ascii="Consolas" w:eastAsia="Times New Roman" w:hAnsi="Consolas" w:cs="Times New Roman"/>
-          <w:color w:val="98C379"/>
-          <w:kern w:val="0"/>
-          <w:sz w:val="21"/>
-          <w:szCs w:val="21"/>
-          <w:lang w:val="en-US" w:eastAsia="ru-RU"/>
-          <w14:ligatures w14:val="none"/>
-        </w:rPr>
-        <w:t>pytest</w:t>
-      </w:r>
-      <w:proofErr w:type="spellEnd"/>
-      <w:r>
-        <w:rPr>
-          <w:rFonts w:ascii="Consolas" w:eastAsia="Times New Roman" w:hAnsi="Consolas" w:cs="Times New Roman"/>
-          <w:color w:val="98C379"/>
-          <w:kern w:val="0"/>
-          <w:sz w:val="21"/>
-          <w:szCs w:val="21"/>
-          <w:lang w:val="en-US" w:eastAsia="ru-RU"/>
-          <w14:ligatures w14:val="none"/>
-        </w:rPr>
-        <w:t xml:space="preserve"> tests/</w:t>
-      </w:r>
-    </w:p>
-    <w:p>
-      <w:pPr>
-        <w:rPr>
-          <w:rFonts w:ascii="Times New Roman" w:hAnsi="Times New Roman" w:cs="Times New Roman"/>
-          <w:sz w:val="28"/>
-          <w:szCs w:val="28"/>
-          <w:lang w:val="en-US"/>
-        </w:rPr>
-      </w:pPr>
+        <w:t>workflows</w:t>
+      </w:r>
+      <w:r>
+        <w:rPr>
+          <w:rFonts w:ascii="Consolas" w:eastAsia="Times New Roman" w:hAnsi="Consolas" w:cs="Times New Roman"/>
+          <w:color w:val="ABB2BF"/>
+          <w:kern w:val="0"/>
+          <w:sz w:val="21"/>
+          <w:szCs w:val="21"/>
+          <w:lang w:val="en-US" w:eastAsia="ru-RU"/>
+          <w14:ligatures w14:val="none"/>
+        </w:rPr>
+        <w:t>: [</w:t>
+      </w:r>
+      <w:r>
+        <w:rPr>
+          <w:rFonts w:ascii="Consolas" w:eastAsia="Times New Roman" w:hAnsi="Consolas" w:cs="Times New Roman"/>
+          <w:color w:val="98C379"/>
+          <w:kern w:val="0"/>
+          <w:sz w:val="21"/>
+          <w:szCs w:val="21"/>
+          <w:lang w:val="en-US" w:eastAsia="ru-RU"/>
+          <w14:ligatures w14:val="none"/>
+        </w:rPr>
+        <w:t>"Test Python App"</w:t>
+      </w:r>
+      <w:r>
+        <w:rPr>
+          <w:rFonts w:ascii="Consolas" w:eastAsia="Times New Roman" w:hAnsi="Consolas" w:cs="Times New Roman"/>
+          <w:color w:val="ABB2BF"/>
+          <w:kern w:val="0"/>
+          <w:sz w:val="21"/>
+          <w:szCs w:val="21"/>
+          <w:lang w:val="en-US" w:eastAsia="ru-RU"/>
+          <w14:ligatures w14:val="none"/>
+        </w:rPr>
+        <w:t>]</w:t>
+      </w:r>
     </w:p>
     <w:p>
       <w:pPr>
@@ -5230,6 +5192,18 @@
       <w:r>
         <w:rPr>
           <w:rFonts w:ascii="Consolas" w:eastAsia="Times New Roman" w:hAnsi="Consolas" w:cs="Times New Roman"/>
+          <w:color w:val="ABB2BF"/>
+          <w:kern w:val="0"/>
+          <w:sz w:val="21"/>
+          <w:szCs w:val="21"/>
+          <w:lang w:val="en-US" w:eastAsia="ru-RU"/>
+          <w14:ligatures w14:val="none"/>
+        </w:rPr>
+        <w:t xml:space="preserve">    </w:t>
+      </w:r>
+      <w:r>
+        <w:rPr>
+          <w:rFonts w:ascii="Consolas" w:eastAsia="Times New Roman" w:hAnsi="Consolas" w:cs="Times New Roman"/>
           <w:color w:val="E06C75"/>
           <w:kern w:val="0"/>
           <w:sz w:val="21"/>
@@ -5237,31 +5211,43 @@
           <w:lang w:val="en-US" w:eastAsia="ru-RU"/>
           <w14:ligatures w14:val="none"/>
         </w:rPr>
-        <w:t>name</w:t>
-      </w:r>
-      <w:r>
-        <w:rPr>
-          <w:rFonts w:ascii="Consolas" w:eastAsia="Times New Roman" w:hAnsi="Consolas" w:cs="Times New Roman"/>
-          <w:color w:val="ABB2BF"/>
-          <w:kern w:val="0"/>
-          <w:sz w:val="21"/>
-          <w:szCs w:val="21"/>
-          <w:lang w:val="en-US" w:eastAsia="ru-RU"/>
-          <w14:ligatures w14:val="none"/>
-        </w:rPr>
-        <w:t xml:space="preserve">: </w:t>
-      </w:r>
-      <w:r>
-        <w:rPr>
-          <w:rFonts w:ascii="Consolas" w:eastAsia="Times New Roman" w:hAnsi="Consolas" w:cs="Times New Roman"/>
-          <w:color w:val="98C379"/>
-          <w:kern w:val="0"/>
-          <w:sz w:val="21"/>
-          <w:szCs w:val="21"/>
-          <w:lang w:val="en-US" w:eastAsia="ru-RU"/>
-          <w14:ligatures w14:val="none"/>
-        </w:rPr>
-        <w:t>Build and Delivery</w:t>
+        <w:t>branches</w:t>
+      </w:r>
+      <w:r>
+        <w:rPr>
+          <w:rFonts w:ascii="Consolas" w:eastAsia="Times New Roman" w:hAnsi="Consolas" w:cs="Times New Roman"/>
+          <w:color w:val="ABB2BF"/>
+          <w:kern w:val="0"/>
+          <w:sz w:val="21"/>
+          <w:szCs w:val="21"/>
+          <w:lang w:val="en-US" w:eastAsia="ru-RU"/>
+          <w14:ligatures w14:val="none"/>
+        </w:rPr>
+        <w:t>: [</w:t>
+      </w:r>
+      <w:r>
+        <w:rPr>
+          <w:rFonts w:ascii="Consolas" w:eastAsia="Times New Roman" w:hAnsi="Consolas" w:cs="Times New Roman"/>
+          <w:color w:val="98C379"/>
+          <w:kern w:val="0"/>
+          <w:sz w:val="21"/>
+          <w:szCs w:val="21"/>
+          <w:lang w:val="en-US" w:eastAsia="ru-RU"/>
+          <w14:ligatures w14:val="none"/>
+        </w:rPr>
+        <w:t>main</w:t>
+      </w:r>
+      <w:r>
+        <w:rPr>
+          <w:rFonts w:ascii="Consolas" w:eastAsia="Times New Roman" w:hAnsi="Consolas" w:cs="Times New Roman"/>
+          <w:color w:val="ABB2BF"/>
+          <w:kern w:val="0"/>
+          <w:sz w:val="21"/>
+          <w:szCs w:val="21"/>
+          <w:lang w:val="en-US" w:eastAsia="ru-RU"/>
+          <w14:ligatures w14:val="none"/>
+        </w:rPr>
+        <w:t>]</w:t>
       </w:r>
     </w:p>
     <w:p>
@@ -5278,6 +5264,42 @@
           <w14:ligatures w14:val="none"/>
         </w:rPr>
       </w:pPr>
+      <w:r>
+        <w:rPr>
+          <w:rFonts w:ascii="Consolas" w:eastAsia="Times New Roman" w:hAnsi="Consolas" w:cs="Times New Roman"/>
+          <w:color w:val="ABB2BF"/>
+          <w:kern w:val="0"/>
+          <w:sz w:val="21"/>
+          <w:szCs w:val="21"/>
+          <w:lang w:val="en-US" w:eastAsia="ru-RU"/>
+          <w14:ligatures w14:val="none"/>
+        </w:rPr>
+        <w:t xml:space="preserve">    </w:t>
+      </w:r>
+      <w:r>
+        <w:rPr>
+          <w:rFonts w:ascii="Consolas" w:eastAsia="Times New Roman" w:hAnsi="Consolas" w:cs="Times New Roman"/>
+          <w:color w:val="E06C75"/>
+          <w:kern w:val="0"/>
+          <w:sz w:val="21"/>
+          <w:szCs w:val="21"/>
+          <w:lang w:val="en-US" w:eastAsia="ru-RU"/>
+          <w14:ligatures w14:val="none"/>
+        </w:rPr>
+        <w:t>types</w:t>
+      </w:r>
+      <w:r>
+        <w:rPr>
+          <w:rFonts w:ascii="Consolas" w:eastAsia="Times New Roman" w:hAnsi="Consolas" w:cs="Times New Roman"/>
+          <w:color w:val="ABB2BF"/>
+          <w:kern w:val="0"/>
+          <w:sz w:val="21"/>
+          <w:szCs w:val="21"/>
+          <w:lang w:val="en-US" w:eastAsia="ru-RU"/>
+          <w14:ligatures w14:val="none"/>
+        </w:rPr>
+        <w:t>:</w:t>
+      </w:r>
     </w:p>
     <w:p>
       <w:pPr>
@@ -5296,26 +5318,26 @@
       <w:r>
         <w:rPr>
           <w:rFonts w:ascii="Consolas" w:eastAsia="Times New Roman" w:hAnsi="Consolas" w:cs="Times New Roman"/>
-          <w:color w:val="E06C75"/>
-          <w:kern w:val="0"/>
-          <w:sz w:val="21"/>
-          <w:szCs w:val="21"/>
-          <w:lang w:val="en-US" w:eastAsia="ru-RU"/>
-          <w14:ligatures w14:val="none"/>
-        </w:rPr>
-        <w:t>on</w:t>
-      </w:r>
-      <w:r>
-        <w:rPr>
-          <w:rFonts w:ascii="Consolas" w:eastAsia="Times New Roman" w:hAnsi="Consolas" w:cs="Times New Roman"/>
-          <w:color w:val="ABB2BF"/>
-          <w:kern w:val="0"/>
-          <w:sz w:val="21"/>
-          <w:szCs w:val="21"/>
-          <w:lang w:val="en-US" w:eastAsia="ru-RU"/>
-          <w14:ligatures w14:val="none"/>
-        </w:rPr>
-        <w:t>:</w:t>
+          <w:color w:val="ABB2BF"/>
+          <w:kern w:val="0"/>
+          <w:sz w:val="21"/>
+          <w:szCs w:val="21"/>
+          <w:lang w:val="en-US" w:eastAsia="ru-RU"/>
+          <w14:ligatures w14:val="none"/>
+        </w:rPr>
+        <w:t xml:space="preserve">      - </w:t>
+      </w:r>
+      <w:r>
+        <w:rPr>
+          <w:rFonts w:ascii="Consolas" w:eastAsia="Times New Roman" w:hAnsi="Consolas" w:cs="Times New Roman"/>
+          <w:color w:val="98C379"/>
+          <w:kern w:val="0"/>
+          <w:sz w:val="21"/>
+          <w:szCs w:val="21"/>
+          <w:lang w:val="en-US" w:eastAsia="ru-RU"/>
+          <w14:ligatures w14:val="none"/>
+        </w:rPr>
+        <w:t>completed</w:t>
       </w:r>
     </w:p>
     <w:p>
@@ -5332,44 +5354,6 @@
           <w14:ligatures w14:val="none"/>
         </w:rPr>
       </w:pPr>
-      <w:r>
-        <w:rPr>
-          <w:rFonts w:ascii="Consolas" w:eastAsia="Times New Roman" w:hAnsi="Consolas" w:cs="Times New Roman"/>
-          <w:color w:val="ABB2BF"/>
-          <w:kern w:val="0"/>
-          <w:sz w:val="21"/>
-          <w:szCs w:val="21"/>
-          <w:lang w:val="en-US" w:eastAsia="ru-RU"/>
-          <w14:ligatures w14:val="none"/>
-        </w:rPr>
-        <w:t xml:space="preserve">  </w:t>
-      </w:r>
-      <w:proofErr w:type="spellStart"/>
-      <w:r>
-        <w:rPr>
-          <w:rFonts w:ascii="Consolas" w:eastAsia="Times New Roman" w:hAnsi="Consolas" w:cs="Times New Roman"/>
-          <w:color w:val="E06C75"/>
-          <w:kern w:val="0"/>
-          <w:sz w:val="21"/>
-          <w:szCs w:val="21"/>
-          <w:lang w:val="en-US" w:eastAsia="ru-RU"/>
-          <w14:ligatures w14:val="none"/>
-        </w:rPr>
-        <w:t>workflow_run</w:t>
-      </w:r>
-      <w:proofErr w:type="spellEnd"/>
-      <w:r>
-        <w:rPr>
-          <w:rFonts w:ascii="Consolas" w:eastAsia="Times New Roman" w:hAnsi="Consolas" w:cs="Times New Roman"/>
-          <w:color w:val="ABB2BF"/>
-          <w:kern w:val="0"/>
-          <w:sz w:val="21"/>
-          <w:szCs w:val="21"/>
-          <w:lang w:val="en-US" w:eastAsia="ru-RU"/>
-          <w14:ligatures w14:val="none"/>
-        </w:rPr>
-        <w:t>:</w:t>
-      </w:r>
     </w:p>
     <w:p>
       <w:pPr>
@@ -5388,18 +5372,6 @@
       <w:r>
         <w:rPr>
           <w:rFonts w:ascii="Consolas" w:eastAsia="Times New Roman" w:hAnsi="Consolas" w:cs="Times New Roman"/>
-          <w:color w:val="ABB2BF"/>
-          <w:kern w:val="0"/>
-          <w:sz w:val="21"/>
-          <w:szCs w:val="21"/>
-          <w:lang w:val="en-US" w:eastAsia="ru-RU"/>
-          <w14:ligatures w14:val="none"/>
-        </w:rPr>
-        <w:t xml:space="preserve">    </w:t>
-      </w:r>
-      <w:r>
-        <w:rPr>
-          <w:rFonts w:ascii="Consolas" w:eastAsia="Times New Roman" w:hAnsi="Consolas" w:cs="Times New Roman"/>
           <w:color w:val="E06C75"/>
           <w:kern w:val="0"/>
           <w:sz w:val="21"/>
@@ -5407,43 +5379,19 @@
           <w:lang w:val="en-US" w:eastAsia="ru-RU"/>
           <w14:ligatures w14:val="none"/>
         </w:rPr>
-        <w:t>workflows</w:t>
-      </w:r>
-      <w:r>
-        <w:rPr>
-          <w:rFonts w:ascii="Consolas" w:eastAsia="Times New Roman" w:hAnsi="Consolas" w:cs="Times New Roman"/>
-          <w:color w:val="ABB2BF"/>
-          <w:kern w:val="0"/>
-          <w:sz w:val="21"/>
-          <w:szCs w:val="21"/>
-          <w:lang w:val="en-US" w:eastAsia="ru-RU"/>
-          <w14:ligatures w14:val="none"/>
-        </w:rPr>
-        <w:t>: [</w:t>
-      </w:r>
-      <w:r>
-        <w:rPr>
-          <w:rFonts w:ascii="Consolas" w:eastAsia="Times New Roman" w:hAnsi="Consolas" w:cs="Times New Roman"/>
-          <w:color w:val="98C379"/>
-          <w:kern w:val="0"/>
-          <w:sz w:val="21"/>
-          <w:szCs w:val="21"/>
-          <w:lang w:val="en-US" w:eastAsia="ru-RU"/>
-          <w14:ligatures w14:val="none"/>
-        </w:rPr>
-        <w:t>"Test Python App"</w:t>
-      </w:r>
-      <w:r>
-        <w:rPr>
-          <w:rFonts w:ascii="Consolas" w:eastAsia="Times New Roman" w:hAnsi="Consolas" w:cs="Times New Roman"/>
-          <w:color w:val="ABB2BF"/>
-          <w:kern w:val="0"/>
-          <w:sz w:val="21"/>
-          <w:szCs w:val="21"/>
-          <w:lang w:val="en-US" w:eastAsia="ru-RU"/>
-          <w14:ligatures w14:val="none"/>
-        </w:rPr>
-        <w:t>]</w:t>
+        <w:t>jobs</w:t>
+      </w:r>
+      <w:r>
+        <w:rPr>
+          <w:rFonts w:ascii="Consolas" w:eastAsia="Times New Roman" w:hAnsi="Consolas" w:cs="Times New Roman"/>
+          <w:color w:val="ABB2BF"/>
+          <w:kern w:val="0"/>
+          <w:sz w:val="21"/>
+          <w:szCs w:val="21"/>
+          <w:lang w:val="en-US" w:eastAsia="ru-RU"/>
+          <w14:ligatures w14:val="none"/>
+        </w:rPr>
+        <w:t>:</w:t>
       </w:r>
     </w:p>
     <w:p>
@@ -5470,7 +5418,7 @@
           <w:lang w:val="en-US" w:eastAsia="ru-RU"/>
           <w14:ligatures w14:val="none"/>
         </w:rPr>
-        <w:t xml:space="preserve">    </w:t>
+        <w:t xml:space="preserve">  </w:t>
       </w:r>
       <w:r>
         <w:rPr>
@@ -5482,43 +5430,19 @@
           <w:lang w:val="en-US" w:eastAsia="ru-RU"/>
           <w14:ligatures w14:val="none"/>
         </w:rPr>
-        <w:t>branches</w:t>
-      </w:r>
-      <w:r>
-        <w:rPr>
-          <w:rFonts w:ascii="Consolas" w:eastAsia="Times New Roman" w:hAnsi="Consolas" w:cs="Times New Roman"/>
-          <w:color w:val="ABB2BF"/>
-          <w:kern w:val="0"/>
-          <w:sz w:val="21"/>
-          <w:szCs w:val="21"/>
-          <w:lang w:val="en-US" w:eastAsia="ru-RU"/>
-          <w14:ligatures w14:val="none"/>
-        </w:rPr>
-        <w:t>: [</w:t>
-      </w:r>
-      <w:r>
-        <w:rPr>
-          <w:rFonts w:ascii="Consolas" w:eastAsia="Times New Roman" w:hAnsi="Consolas" w:cs="Times New Roman"/>
-          <w:color w:val="98C379"/>
-          <w:kern w:val="0"/>
-          <w:sz w:val="21"/>
-          <w:szCs w:val="21"/>
-          <w:lang w:val="en-US" w:eastAsia="ru-RU"/>
-          <w14:ligatures w14:val="none"/>
-        </w:rPr>
-        <w:t>main</w:t>
-      </w:r>
-      <w:r>
-        <w:rPr>
-          <w:rFonts w:ascii="Consolas" w:eastAsia="Times New Roman" w:hAnsi="Consolas" w:cs="Times New Roman"/>
-          <w:color w:val="ABB2BF"/>
-          <w:kern w:val="0"/>
-          <w:sz w:val="21"/>
-          <w:szCs w:val="21"/>
-          <w:lang w:val="en-US" w:eastAsia="ru-RU"/>
-          <w14:ligatures w14:val="none"/>
-        </w:rPr>
-        <w:t>]</w:t>
+        <w:t>cd</w:t>
+      </w:r>
+      <w:r>
+        <w:rPr>
+          <w:rFonts w:ascii="Consolas" w:eastAsia="Times New Roman" w:hAnsi="Consolas" w:cs="Times New Roman"/>
+          <w:color w:val="ABB2BF"/>
+          <w:kern w:val="0"/>
+          <w:sz w:val="21"/>
+          <w:szCs w:val="21"/>
+          <w:lang w:val="en-US" w:eastAsia="ru-RU"/>
+          <w14:ligatures w14:val="none"/>
+        </w:rPr>
+        <w:t>:</w:t>
       </w:r>
     </w:p>
     <w:p>
@@ -5557,19 +5481,31 @@
           <w:lang w:val="en-US" w:eastAsia="ru-RU"/>
           <w14:ligatures w14:val="none"/>
         </w:rPr>
-        <w:t>types</w:t>
-      </w:r>
-      <w:r>
-        <w:rPr>
-          <w:rFonts w:ascii="Consolas" w:eastAsia="Times New Roman" w:hAnsi="Consolas" w:cs="Times New Roman"/>
-          <w:color w:val="ABB2BF"/>
-          <w:kern w:val="0"/>
-          <w:sz w:val="21"/>
-          <w:szCs w:val="21"/>
-          <w:lang w:val="en-US" w:eastAsia="ru-RU"/>
-          <w14:ligatures w14:val="none"/>
-        </w:rPr>
-        <w:t>:</w:t>
+        <w:t>runs-on</w:t>
+      </w:r>
+      <w:r>
+        <w:rPr>
+          <w:rFonts w:ascii="Consolas" w:eastAsia="Times New Roman" w:hAnsi="Consolas" w:cs="Times New Roman"/>
+          <w:color w:val="ABB2BF"/>
+          <w:kern w:val="0"/>
+          <w:sz w:val="21"/>
+          <w:szCs w:val="21"/>
+          <w:lang w:val="en-US" w:eastAsia="ru-RU"/>
+          <w14:ligatures w14:val="none"/>
+        </w:rPr>
+        <w:t xml:space="preserve">: </w:t>
+      </w:r>
+      <w:r>
+        <w:rPr>
+          <w:rFonts w:ascii="Consolas" w:eastAsia="Times New Roman" w:hAnsi="Consolas" w:cs="Times New Roman"/>
+          <w:color w:val="98C379"/>
+          <w:kern w:val="0"/>
+          <w:sz w:val="21"/>
+          <w:szCs w:val="21"/>
+          <w:lang w:val="en-US" w:eastAsia="ru-RU"/>
+          <w14:ligatures w14:val="none"/>
+        </w:rPr>
+        <w:t>ubuntu-latest</w:t>
       </w:r>
     </w:p>
     <w:p>
@@ -5586,30 +5522,6 @@
           <w14:ligatures w14:val="none"/>
         </w:rPr>
       </w:pPr>
-      <w:r>
-        <w:rPr>
-          <w:rFonts w:ascii="Consolas" w:eastAsia="Times New Roman" w:hAnsi="Consolas" w:cs="Times New Roman"/>
-          <w:color w:val="ABB2BF"/>
-          <w:kern w:val="0"/>
-          <w:sz w:val="21"/>
-          <w:szCs w:val="21"/>
-          <w:lang w:val="en-US" w:eastAsia="ru-RU"/>
-          <w14:ligatures w14:val="none"/>
-        </w:rPr>
-        <w:t xml:space="preserve">      - </w:t>
-      </w:r>
-      <w:r>
-        <w:rPr>
-          <w:rFonts w:ascii="Consolas" w:eastAsia="Times New Roman" w:hAnsi="Consolas" w:cs="Times New Roman"/>
-          <w:color w:val="98C379"/>
-          <w:kern w:val="0"/>
-          <w:sz w:val="21"/>
-          <w:szCs w:val="21"/>
-          <w:lang w:val="en-US" w:eastAsia="ru-RU"/>
-          <w14:ligatures w14:val="none"/>
-        </w:rPr>
-        <w:t>completed</w:t>
-      </w:r>
     </w:p>
     <w:p>
       <w:pPr>
@@ -5625,6 +5537,172 @@
           <w14:ligatures w14:val="none"/>
         </w:rPr>
       </w:pPr>
+      <w:r>
+        <w:rPr>
+          <w:rFonts w:ascii="Consolas" w:eastAsia="Times New Roman" w:hAnsi="Consolas" w:cs="Times New Roman"/>
+          <w:color w:val="ABB2BF"/>
+          <w:kern w:val="0"/>
+          <w:sz w:val="21"/>
+          <w:szCs w:val="21"/>
+          <w:lang w:val="en-US" w:eastAsia="ru-RU"/>
+          <w14:ligatures w14:val="none"/>
+        </w:rPr>
+        <w:t xml:space="preserve">    </w:t>
+      </w:r>
+      <w:r>
+        <w:rPr>
+          <w:rFonts w:ascii="Consolas" w:eastAsia="Times New Roman" w:hAnsi="Consolas" w:cs="Times New Roman"/>
+          <w:color w:val="E06C75"/>
+          <w:kern w:val="0"/>
+          <w:sz w:val="21"/>
+          <w:szCs w:val="21"/>
+          <w:lang w:val="en-US" w:eastAsia="ru-RU"/>
+          <w14:ligatures w14:val="none"/>
+        </w:rPr>
+        <w:t>if</w:t>
+      </w:r>
+      <w:r>
+        <w:rPr>
+          <w:rFonts w:ascii="Consolas" w:eastAsia="Times New Roman" w:hAnsi="Consolas" w:cs="Times New Roman"/>
+          <w:color w:val="ABB2BF"/>
+          <w:kern w:val="0"/>
+          <w:sz w:val="21"/>
+          <w:szCs w:val="21"/>
+          <w:lang w:val="en-US" w:eastAsia="ru-RU"/>
+          <w14:ligatures w14:val="none"/>
+        </w:rPr>
+        <w:t xml:space="preserve">: </w:t>
+      </w:r>
+      <w:r>
+        <w:rPr>
+          <w:rFonts w:ascii="Consolas" w:eastAsia="Times New Roman" w:hAnsi="Consolas" w:cs="Times New Roman"/>
+          <w:color w:val="98C379"/>
+          <w:kern w:val="0"/>
+          <w:sz w:val="21"/>
+          <w:szCs w:val="21"/>
+          <w:lang w:val="en-US" w:eastAsia="ru-RU"/>
+          <w14:ligatures w14:val="none"/>
+        </w:rPr>
+        <w:t>$</w:t>
+      </w:r>
+      <w:proofErr w:type="gramStart"/>
+      <w:r>
+        <w:rPr>
+          <w:rFonts w:ascii="Consolas" w:eastAsia="Times New Roman" w:hAnsi="Consolas" w:cs="Times New Roman"/>
+          <w:color w:val="98C379"/>
+          <w:kern w:val="0"/>
+          <w:sz w:val="21"/>
+          <w:szCs w:val="21"/>
+          <w:lang w:val="en-US" w:eastAsia="ru-RU"/>
+          <w14:ligatures w14:val="none"/>
+        </w:rPr>
+        <w:t xml:space="preserve">{{ </w:t>
+      </w:r>
+      <w:proofErr w:type="spellStart"/>
+      <w:r>
+        <w:rPr>
+          <w:rFonts w:ascii="Consolas" w:eastAsia="Times New Roman" w:hAnsi="Consolas" w:cs="Times New Roman"/>
+          <w:color w:val="98C379"/>
+          <w:kern w:val="0"/>
+          <w:sz w:val="21"/>
+          <w:szCs w:val="21"/>
+          <w:lang w:val="en-US" w:eastAsia="ru-RU"/>
+          <w14:ligatures w14:val="none"/>
+        </w:rPr>
+        <w:t>github</w:t>
+      </w:r>
+      <w:proofErr w:type="gramEnd"/>
+      <w:r>
+        <w:rPr>
+          <w:rFonts w:ascii="Consolas" w:eastAsia="Times New Roman" w:hAnsi="Consolas" w:cs="Times New Roman"/>
+          <w:color w:val="98C379"/>
+          <w:kern w:val="0"/>
+          <w:sz w:val="21"/>
+          <w:szCs w:val="21"/>
+          <w:lang w:val="en-US" w:eastAsia="ru-RU"/>
+          <w14:ligatures w14:val="none"/>
+        </w:rPr>
+        <w:t>.</w:t>
+      </w:r>
+      <w:proofErr w:type="gramStart"/>
+      <w:r>
+        <w:rPr>
+          <w:rFonts w:ascii="Consolas" w:eastAsia="Times New Roman" w:hAnsi="Consolas" w:cs="Times New Roman"/>
+          <w:color w:val="98C379"/>
+          <w:kern w:val="0"/>
+          <w:sz w:val="21"/>
+          <w:szCs w:val="21"/>
+          <w:lang w:val="en-US" w:eastAsia="ru-RU"/>
+          <w14:ligatures w14:val="none"/>
+        </w:rPr>
+        <w:t>event.workflow</w:t>
+      </w:r>
+      <w:proofErr w:type="gramEnd"/>
+      <w:r>
+        <w:rPr>
+          <w:rFonts w:ascii="Consolas" w:eastAsia="Times New Roman" w:hAnsi="Consolas" w:cs="Times New Roman"/>
+          <w:color w:val="98C379"/>
+          <w:kern w:val="0"/>
+          <w:sz w:val="21"/>
+          <w:szCs w:val="21"/>
+          <w:lang w:val="en-US" w:eastAsia="ru-RU"/>
+          <w14:ligatures w14:val="none"/>
+        </w:rPr>
+        <w:t>_</w:t>
+      </w:r>
+      <w:proofErr w:type="gramStart"/>
+      <w:r>
+        <w:rPr>
+          <w:rFonts w:ascii="Consolas" w:eastAsia="Times New Roman" w:hAnsi="Consolas" w:cs="Times New Roman"/>
+          <w:color w:val="98C379"/>
+          <w:kern w:val="0"/>
+          <w:sz w:val="21"/>
+          <w:szCs w:val="21"/>
+          <w:lang w:val="en-US" w:eastAsia="ru-RU"/>
+          <w14:ligatures w14:val="none"/>
+        </w:rPr>
+        <w:t>run.conclusion</w:t>
+      </w:r>
+      <w:proofErr w:type="spellEnd"/>
+      <w:proofErr w:type="gramEnd"/>
+      <w:r>
+        <w:rPr>
+          <w:rFonts w:ascii="Consolas" w:eastAsia="Times New Roman" w:hAnsi="Consolas" w:cs="Times New Roman"/>
+          <w:color w:val="98C379"/>
+          <w:kern w:val="0"/>
+          <w:sz w:val="21"/>
+          <w:szCs w:val="21"/>
+          <w:lang w:val="en-US" w:eastAsia="ru-RU"/>
+          <w14:ligatures w14:val="none"/>
+        </w:rPr>
+        <w:t xml:space="preserve"> == 'success</w:t>
+      </w:r>
+      <w:proofErr w:type="gramStart"/>
+      <w:r>
+        <w:rPr>
+          <w:rFonts w:ascii="Consolas" w:eastAsia="Times New Roman" w:hAnsi="Consolas" w:cs="Times New Roman"/>
+          <w:color w:val="98C379"/>
+          <w:kern w:val="0"/>
+          <w:sz w:val="21"/>
+          <w:szCs w:val="21"/>
+          <w:lang w:val="en-US" w:eastAsia="ru-RU"/>
+          <w14:ligatures w14:val="none"/>
+        </w:rPr>
+        <w:t>' }</w:t>
+      </w:r>
+      <w:proofErr w:type="gramEnd"/>
+      <w:r>
+        <w:rPr>
+          <w:rFonts w:ascii="Consolas" w:eastAsia="Times New Roman" w:hAnsi="Consolas" w:cs="Times New Roman"/>
+          <w:color w:val="98C379"/>
+          <w:kern w:val="0"/>
+          <w:sz w:val="21"/>
+          <w:szCs w:val="21"/>
+          <w:lang w:val="en-US" w:eastAsia="ru-RU"/>
+          <w14:ligatures w14:val="none"/>
+        </w:rPr>
+        <w:t>}</w:t>
+      </w:r>
     </w:p>
     <w:p>
       <w:pPr>
@@ -5640,30 +5718,6 @@
           <w14:ligatures w14:val="none"/>
         </w:rPr>
       </w:pPr>
-      <w:r>
-        <w:rPr>
-          <w:rFonts w:ascii="Consolas" w:eastAsia="Times New Roman" w:hAnsi="Consolas" w:cs="Times New Roman"/>
-          <w:color w:val="E06C75"/>
-          <w:kern w:val="0"/>
-          <w:sz w:val="21"/>
-          <w:szCs w:val="21"/>
-          <w:lang w:val="en-US" w:eastAsia="ru-RU"/>
-          <w14:ligatures w14:val="none"/>
-        </w:rPr>
-        <w:t>env</w:t>
-      </w:r>
-      <w:r>
-        <w:rPr>
-          <w:rFonts w:ascii="Consolas" w:eastAsia="Times New Roman" w:hAnsi="Consolas" w:cs="Times New Roman"/>
-          <w:color w:val="ABB2BF"/>
-          <w:kern w:val="0"/>
-          <w:sz w:val="21"/>
-          <w:szCs w:val="21"/>
-          <w:lang w:val="en-US" w:eastAsia="ru-RU"/>
-          <w14:ligatures w14:val="none"/>
-        </w:rPr>
-        <w:t>:</w:t>
-      </w:r>
     </w:p>
     <w:p>
       <w:pPr>
@@ -5689,7 +5743,7 @@
           <w:lang w:val="en-US" w:eastAsia="ru-RU"/>
           <w14:ligatures w14:val="none"/>
         </w:rPr>
-        <w:t xml:space="preserve">  </w:t>
+        <w:t xml:space="preserve">    </w:t>
       </w:r>
       <w:r>
         <w:rPr>
@@ -5701,31 +5755,19 @@
           <w:lang w:val="en-US" w:eastAsia="ru-RU"/>
           <w14:ligatures w14:val="none"/>
         </w:rPr>
-        <w:t>FORCE_JAVASCRIPT_ACTIONS_TO_NODE24</w:t>
-      </w:r>
-      <w:r>
-        <w:rPr>
-          <w:rFonts w:ascii="Consolas" w:eastAsia="Times New Roman" w:hAnsi="Consolas" w:cs="Times New Roman"/>
-          <w:color w:val="ABB2BF"/>
-          <w:kern w:val="0"/>
-          <w:sz w:val="21"/>
-          <w:szCs w:val="21"/>
-          <w:lang w:val="en-US" w:eastAsia="ru-RU"/>
-          <w14:ligatures w14:val="none"/>
-        </w:rPr>
-        <w:t xml:space="preserve">: </w:t>
-      </w:r>
-      <w:r>
-        <w:rPr>
-          <w:rFonts w:ascii="Consolas" w:eastAsia="Times New Roman" w:hAnsi="Consolas" w:cs="Times New Roman"/>
-          <w:color w:val="D19A66"/>
-          <w:kern w:val="0"/>
-          <w:sz w:val="21"/>
-          <w:szCs w:val="21"/>
-          <w:lang w:val="en-US" w:eastAsia="ru-RU"/>
-          <w14:ligatures w14:val="none"/>
-        </w:rPr>
-        <w:t>true</w:t>
+        <w:t>steps</w:t>
+      </w:r>
+      <w:r>
+        <w:rPr>
+          <w:rFonts w:ascii="Consolas" w:eastAsia="Times New Roman" w:hAnsi="Consolas" w:cs="Times New Roman"/>
+          <w:color w:val="ABB2BF"/>
+          <w:kern w:val="0"/>
+          <w:sz w:val="21"/>
+          <w:szCs w:val="21"/>
+          <w:lang w:val="en-US" w:eastAsia="ru-RU"/>
+          <w14:ligatures w14:val="none"/>
+        </w:rPr>
+        <w:t>:</w:t>
       </w:r>
     </w:p>
     <w:p>
@@ -5742,6 +5784,54 @@
           <w14:ligatures w14:val="none"/>
         </w:rPr>
       </w:pPr>
+      <w:r>
+        <w:rPr>
+          <w:rFonts w:ascii="Consolas" w:eastAsia="Times New Roman" w:hAnsi="Consolas" w:cs="Times New Roman"/>
+          <w:color w:val="ABB2BF"/>
+          <w:kern w:val="0"/>
+          <w:sz w:val="21"/>
+          <w:szCs w:val="21"/>
+          <w:lang w:val="en-US" w:eastAsia="ru-RU"/>
+          <w14:ligatures w14:val="none"/>
+        </w:rPr>
+        <w:t xml:space="preserve">      - </w:t>
+      </w:r>
+      <w:r>
+        <w:rPr>
+          <w:rFonts w:ascii="Consolas" w:eastAsia="Times New Roman" w:hAnsi="Consolas" w:cs="Times New Roman"/>
+          <w:color w:val="E06C75"/>
+          <w:kern w:val="0"/>
+          <w:sz w:val="21"/>
+          <w:szCs w:val="21"/>
+          <w:lang w:val="en-US" w:eastAsia="ru-RU"/>
+          <w14:ligatures w14:val="none"/>
+        </w:rPr>
+        <w:t>name</w:t>
+      </w:r>
+      <w:r>
+        <w:rPr>
+          <w:rFonts w:ascii="Consolas" w:eastAsia="Times New Roman" w:hAnsi="Consolas" w:cs="Times New Roman"/>
+          <w:color w:val="ABB2BF"/>
+          <w:kern w:val="0"/>
+          <w:sz w:val="21"/>
+          <w:szCs w:val="21"/>
+          <w:lang w:val="en-US" w:eastAsia="ru-RU"/>
+          <w14:ligatures w14:val="none"/>
+        </w:rPr>
+        <w:t xml:space="preserve">: </w:t>
+      </w:r>
+      <w:r>
+        <w:rPr>
+          <w:rFonts w:ascii="Consolas" w:eastAsia="Times New Roman" w:hAnsi="Consolas" w:cs="Times New Roman"/>
+          <w:color w:val="98C379"/>
+          <w:kern w:val="0"/>
+          <w:sz w:val="21"/>
+          <w:szCs w:val="21"/>
+          <w:lang w:val="en-US" w:eastAsia="ru-RU"/>
+          <w14:ligatures w14:val="none"/>
+        </w:rPr>
+        <w:t>Login to Docker Hub</w:t>
+      </w:r>
     </w:p>
     <w:p>
       <w:pPr>
@@ -5760,6 +5850,18 @@
       <w:r>
         <w:rPr>
           <w:rFonts w:ascii="Consolas" w:eastAsia="Times New Roman" w:hAnsi="Consolas" w:cs="Times New Roman"/>
+          <w:color w:val="ABB2BF"/>
+          <w:kern w:val="0"/>
+          <w:sz w:val="21"/>
+          <w:szCs w:val="21"/>
+          <w:lang w:val="en-US" w:eastAsia="ru-RU"/>
+          <w14:ligatures w14:val="none"/>
+        </w:rPr>
+        <w:t xml:space="preserve">        </w:t>
+      </w:r>
+      <w:r>
+        <w:rPr>
+          <w:rFonts w:ascii="Consolas" w:eastAsia="Times New Roman" w:hAnsi="Consolas" w:cs="Times New Roman"/>
           <w:color w:val="E06C75"/>
           <w:kern w:val="0"/>
           <w:sz w:val="21"/>
@@ -5767,19 +5869,31 @@
           <w:lang w:val="en-US" w:eastAsia="ru-RU"/>
           <w14:ligatures w14:val="none"/>
         </w:rPr>
-        <w:t>jobs</w:t>
-      </w:r>
-      <w:r>
-        <w:rPr>
-          <w:rFonts w:ascii="Consolas" w:eastAsia="Times New Roman" w:hAnsi="Consolas" w:cs="Times New Roman"/>
-          <w:color w:val="ABB2BF"/>
-          <w:kern w:val="0"/>
-          <w:sz w:val="21"/>
-          <w:szCs w:val="21"/>
-          <w:lang w:val="en-US" w:eastAsia="ru-RU"/>
-          <w14:ligatures w14:val="none"/>
-        </w:rPr>
-        <w:t>:</w:t>
+        <w:t>uses</w:t>
+      </w:r>
+      <w:r>
+        <w:rPr>
+          <w:rFonts w:ascii="Consolas" w:eastAsia="Times New Roman" w:hAnsi="Consolas" w:cs="Times New Roman"/>
+          <w:color w:val="ABB2BF"/>
+          <w:kern w:val="0"/>
+          <w:sz w:val="21"/>
+          <w:szCs w:val="21"/>
+          <w:lang w:val="en-US" w:eastAsia="ru-RU"/>
+          <w14:ligatures w14:val="none"/>
+        </w:rPr>
+        <w:t xml:space="preserve">: </w:t>
+      </w:r>
+      <w:r>
+        <w:rPr>
+          <w:rFonts w:ascii="Consolas" w:eastAsia="Times New Roman" w:hAnsi="Consolas" w:cs="Times New Roman"/>
+          <w:color w:val="98C379"/>
+          <w:kern w:val="0"/>
+          <w:sz w:val="21"/>
+          <w:szCs w:val="21"/>
+          <w:lang w:val="en-US" w:eastAsia="ru-RU"/>
+          <w14:ligatures w14:val="none"/>
+        </w:rPr>
+        <w:t>docker/login-action@v3</w:t>
       </w:r>
     </w:p>
     <w:p>
@@ -5806,7 +5920,7 @@
           <w:lang w:val="en-US" w:eastAsia="ru-RU"/>
           <w14:ligatures w14:val="none"/>
         </w:rPr>
-        <w:t xml:space="preserve">  </w:t>
+        <w:t xml:space="preserve">        </w:t>
       </w:r>
       <w:r>
         <w:rPr>
@@ -5818,7 +5932,7 @@
           <w:lang w:val="en-US" w:eastAsia="ru-RU"/>
           <w14:ligatures w14:val="none"/>
         </w:rPr>
-        <w:t>cd</w:t>
+        <w:t>with</w:t>
       </w:r>
       <w:r>
         <w:rPr>
@@ -5857,7 +5971,7 @@
           <w:lang w:val="en-US" w:eastAsia="ru-RU"/>
           <w14:ligatures w14:val="none"/>
         </w:rPr>
-        <w:t xml:space="preserve">    </w:t>
+        <w:t xml:space="preserve">          </w:t>
       </w:r>
       <w:r>
         <w:rPr>
@@ -5869,7 +5983,7 @@
           <w:lang w:val="en-US" w:eastAsia="ru-RU"/>
           <w14:ligatures w14:val="none"/>
         </w:rPr>
-        <w:t>runs-on</w:t>
+        <w:t>username</w:t>
       </w:r>
       <w:r>
         <w:rPr>
@@ -5893,7 +6007,85 @@
           <w:lang w:val="en-US" w:eastAsia="ru-RU"/>
           <w14:ligatures w14:val="none"/>
         </w:rPr>
-        <w:t>ubuntu-latest</w:t>
+        <w:t>$</w:t>
+      </w:r>
+      <w:proofErr w:type="gramStart"/>
+      <w:r>
+        <w:rPr>
+          <w:rFonts w:ascii="Consolas" w:eastAsia="Times New Roman" w:hAnsi="Consolas" w:cs="Times New Roman"/>
+          <w:color w:val="98C379"/>
+          <w:kern w:val="0"/>
+          <w:sz w:val="21"/>
+          <w:szCs w:val="21"/>
+          <w:lang w:val="en-US" w:eastAsia="ru-RU"/>
+          <w14:ligatures w14:val="none"/>
+        </w:rPr>
+        <w:t xml:space="preserve">{{ </w:t>
+      </w:r>
+      <w:proofErr w:type="spellStart"/>
+      <w:r>
+        <w:rPr>
+          <w:rFonts w:ascii="Consolas" w:eastAsia="Times New Roman" w:hAnsi="Consolas" w:cs="Times New Roman"/>
+          <w:color w:val="98C379"/>
+          <w:kern w:val="0"/>
+          <w:sz w:val="21"/>
+          <w:szCs w:val="21"/>
+          <w:lang w:val="en-US" w:eastAsia="ru-RU"/>
+          <w14:ligatures w14:val="none"/>
+        </w:rPr>
+        <w:t>vars</w:t>
+      </w:r>
+      <w:proofErr w:type="gramEnd"/>
+      <w:r>
+        <w:rPr>
+          <w:rFonts w:ascii="Consolas" w:eastAsia="Times New Roman" w:hAnsi="Consolas" w:cs="Times New Roman"/>
+          <w:color w:val="98C379"/>
+          <w:kern w:val="0"/>
+          <w:sz w:val="21"/>
+          <w:szCs w:val="21"/>
+          <w:lang w:val="en-US" w:eastAsia="ru-RU"/>
+          <w14:ligatures w14:val="none"/>
+        </w:rPr>
+        <w:t>.DOCKERHUB_</w:t>
+      </w:r>
+      <w:proofErr w:type="gramStart"/>
+      <w:r>
+        <w:rPr>
+          <w:rFonts w:ascii="Consolas" w:eastAsia="Times New Roman" w:hAnsi="Consolas" w:cs="Times New Roman"/>
+          <w:color w:val="98C379"/>
+          <w:kern w:val="0"/>
+          <w:sz w:val="21"/>
+          <w:szCs w:val="21"/>
+          <w:lang w:val="en-US" w:eastAsia="ru-RU"/>
+          <w14:ligatures w14:val="none"/>
+        </w:rPr>
+        <w:t>USERNAME</w:t>
+      </w:r>
+      <w:proofErr w:type="spellEnd"/>
+      <w:r>
+        <w:rPr>
+          <w:rFonts w:ascii="Consolas" w:eastAsia="Times New Roman" w:hAnsi="Consolas" w:cs="Times New Roman"/>
+          <w:color w:val="98C379"/>
+          <w:kern w:val="0"/>
+          <w:sz w:val="21"/>
+          <w:szCs w:val="21"/>
+          <w:lang w:val="en-US" w:eastAsia="ru-RU"/>
+          <w14:ligatures w14:val="none"/>
+        </w:rPr>
+        <w:t xml:space="preserve"> }</w:t>
+      </w:r>
+      <w:proofErr w:type="gramEnd"/>
+      <w:r>
+        <w:rPr>
+          <w:rFonts w:ascii="Consolas" w:eastAsia="Times New Roman" w:hAnsi="Consolas" w:cs="Times New Roman"/>
+          <w:color w:val="98C379"/>
+          <w:kern w:val="0"/>
+          <w:sz w:val="21"/>
+          <w:szCs w:val="21"/>
+          <w:lang w:val="en-US" w:eastAsia="ru-RU"/>
+          <w14:ligatures w14:val="none"/>
+        </w:rPr>
+        <w:t>}</w:t>
       </w:r>
     </w:p>
     <w:p>
@@ -5910,6 +6102,132 @@
           <w14:ligatures w14:val="none"/>
         </w:rPr>
       </w:pPr>
+      <w:r>
+        <w:rPr>
+          <w:rFonts w:ascii="Consolas" w:eastAsia="Times New Roman" w:hAnsi="Consolas" w:cs="Times New Roman"/>
+          <w:color w:val="ABB2BF"/>
+          <w:kern w:val="0"/>
+          <w:sz w:val="21"/>
+          <w:szCs w:val="21"/>
+          <w:lang w:val="en-US" w:eastAsia="ru-RU"/>
+          <w14:ligatures w14:val="none"/>
+        </w:rPr>
+        <w:t xml:space="preserve">          </w:t>
+      </w:r>
+      <w:r>
+        <w:rPr>
+          <w:rFonts w:ascii="Consolas" w:eastAsia="Times New Roman" w:hAnsi="Consolas" w:cs="Times New Roman"/>
+          <w:color w:val="E06C75"/>
+          <w:kern w:val="0"/>
+          <w:sz w:val="21"/>
+          <w:szCs w:val="21"/>
+          <w:lang w:val="en-US" w:eastAsia="ru-RU"/>
+          <w14:ligatures w14:val="none"/>
+        </w:rPr>
+        <w:t>password</w:t>
+      </w:r>
+      <w:r>
+        <w:rPr>
+          <w:rFonts w:ascii="Consolas" w:eastAsia="Times New Roman" w:hAnsi="Consolas" w:cs="Times New Roman"/>
+          <w:color w:val="ABB2BF"/>
+          <w:kern w:val="0"/>
+          <w:sz w:val="21"/>
+          <w:szCs w:val="21"/>
+          <w:lang w:val="en-US" w:eastAsia="ru-RU"/>
+          <w14:ligatures w14:val="none"/>
+        </w:rPr>
+        <w:t xml:space="preserve">: </w:t>
+      </w:r>
+      <w:r>
+        <w:rPr>
+          <w:rFonts w:ascii="Consolas" w:eastAsia="Times New Roman" w:hAnsi="Consolas" w:cs="Times New Roman"/>
+          <w:color w:val="98C379"/>
+          <w:kern w:val="0"/>
+          <w:sz w:val="21"/>
+          <w:szCs w:val="21"/>
+          <w:lang w:val="en-US" w:eastAsia="ru-RU"/>
+          <w14:ligatures w14:val="none"/>
+        </w:rPr>
+        <w:t>$</w:t>
+      </w:r>
+      <w:proofErr w:type="gramStart"/>
+      <w:r>
+        <w:rPr>
+          <w:rFonts w:ascii="Consolas" w:eastAsia="Times New Roman" w:hAnsi="Consolas" w:cs="Times New Roman"/>
+          <w:color w:val="98C379"/>
+          <w:kern w:val="0"/>
+          <w:sz w:val="21"/>
+          <w:szCs w:val="21"/>
+          <w:lang w:val="en-US" w:eastAsia="ru-RU"/>
+          <w14:ligatures w14:val="none"/>
+        </w:rPr>
+        <w:t xml:space="preserve">{{ </w:t>
+      </w:r>
+      <w:proofErr w:type="spellStart"/>
+      <w:r>
+        <w:rPr>
+          <w:rFonts w:ascii="Consolas" w:eastAsia="Times New Roman" w:hAnsi="Consolas" w:cs="Times New Roman"/>
+          <w:color w:val="98C379"/>
+          <w:kern w:val="0"/>
+          <w:sz w:val="21"/>
+          <w:szCs w:val="21"/>
+          <w:lang w:val="en-US" w:eastAsia="ru-RU"/>
+          <w14:ligatures w14:val="none"/>
+        </w:rPr>
+        <w:t>secrets</w:t>
+      </w:r>
+      <w:proofErr w:type="gramEnd"/>
+      <w:r>
+        <w:rPr>
+          <w:rFonts w:ascii="Consolas" w:eastAsia="Times New Roman" w:hAnsi="Consolas" w:cs="Times New Roman"/>
+          <w:color w:val="98C379"/>
+          <w:kern w:val="0"/>
+          <w:sz w:val="21"/>
+          <w:szCs w:val="21"/>
+          <w:lang w:val="en-US" w:eastAsia="ru-RU"/>
+          <w14:ligatures w14:val="none"/>
+        </w:rPr>
+        <w:t>.DOCKERHUB_</w:t>
+      </w:r>
+      <w:proofErr w:type="gramStart"/>
+      <w:r>
+        <w:rPr>
+          <w:rFonts w:ascii="Consolas" w:eastAsia="Times New Roman" w:hAnsi="Consolas" w:cs="Times New Roman"/>
+          <w:color w:val="98C379"/>
+          <w:kern w:val="0"/>
+          <w:sz w:val="21"/>
+          <w:szCs w:val="21"/>
+          <w:lang w:val="en-US" w:eastAsia="ru-RU"/>
+          <w14:ligatures w14:val="none"/>
+        </w:rPr>
+        <w:t>TOKEN</w:t>
+      </w:r>
+      <w:proofErr w:type="spellEnd"/>
+      <w:r>
+        <w:rPr>
+          <w:rFonts w:ascii="Consolas" w:eastAsia="Times New Roman" w:hAnsi="Consolas" w:cs="Times New Roman"/>
+          <w:color w:val="98C379"/>
+          <w:kern w:val="0"/>
+          <w:sz w:val="21"/>
+          <w:szCs w:val="21"/>
+          <w:lang w:val="en-US" w:eastAsia="ru-RU"/>
+          <w14:ligatures w14:val="none"/>
+        </w:rPr>
+        <w:t xml:space="preserve"> }</w:t>
+      </w:r>
+      <w:proofErr w:type="gramEnd"/>
+      <w:r>
+        <w:rPr>
+          <w:rFonts w:ascii="Consolas" w:eastAsia="Times New Roman" w:hAnsi="Consolas" w:cs="Times New Roman"/>
+          <w:color w:val="98C379"/>
+          <w:kern w:val="0"/>
+          <w:sz w:val="21"/>
+          <w:szCs w:val="21"/>
+          <w:lang w:val="en-US" w:eastAsia="ru-RU"/>
+          <w14:ligatures w14:val="none"/>
+        </w:rPr>
+        <w:t>}</w:t>
+      </w:r>
     </w:p>
     <w:p>
       <w:pPr>
@@ -5935,7 +6253,34 @@
           <w:lang w:val="en-US" w:eastAsia="ru-RU"/>
           <w14:ligatures w14:val="none"/>
         </w:rPr>
-        <w:t xml:space="preserve">    </w:t>
+        <w:t xml:space="preserve">          </w:t>
+      </w:r>
+    </w:p>
+    <w:p>
+      <w:pPr>
+        <w:shd w:val="clear" w:color="auto" w:fill="282C34"/>
+        <w:spacing w:after="0" w:line="285" w:lineRule="atLeast"/>
+        <w:rPr>
+          <w:rFonts w:ascii="Consolas" w:eastAsia="Times New Roman" w:hAnsi="Consolas" w:cs="Times New Roman"/>
+          <w:color w:val="ABB2BF"/>
+          <w:kern w:val="0"/>
+          <w:sz w:val="21"/>
+          <w:szCs w:val="21"/>
+          <w:lang w:val="en-US" w:eastAsia="ru-RU"/>
+          <w14:ligatures w14:val="none"/>
+        </w:rPr>
+      </w:pPr>
+      <w:r>
+        <w:rPr>
+          <w:rFonts w:ascii="Consolas" w:eastAsia="Times New Roman" w:hAnsi="Consolas" w:cs="Times New Roman"/>
+          <w:color w:val="ABB2BF"/>
+          <w:kern w:val="0"/>
+          <w:sz w:val="21"/>
+          <w:szCs w:val="21"/>
+          <w:lang w:val="en-US" w:eastAsia="ru-RU"/>
+          <w14:ligatures w14:val="none"/>
+        </w:rPr>
+        <w:t xml:space="preserve">      - </w:t>
       </w:r>
       <w:r>
         <w:rPr>
@@ -5947,7 +6292,7 @@
           <w:lang w:val="en-US" w:eastAsia="ru-RU"/>
           <w14:ligatures w14:val="none"/>
         </w:rPr>
-        <w:t>if</w:t>
+        <w:t>name</w:t>
       </w:r>
       <w:r>
         <w:rPr>
@@ -5971,6 +6316,247 @@
           <w:lang w:val="en-US" w:eastAsia="ru-RU"/>
           <w14:ligatures w14:val="none"/>
         </w:rPr>
+        <w:t>Build and push image</w:t>
+      </w:r>
+    </w:p>
+    <w:p>
+      <w:pPr>
+        <w:shd w:val="clear" w:color="auto" w:fill="282C34"/>
+        <w:spacing w:after="0" w:line="285" w:lineRule="atLeast"/>
+        <w:rPr>
+          <w:rFonts w:ascii="Consolas" w:eastAsia="Times New Roman" w:hAnsi="Consolas" w:cs="Times New Roman"/>
+          <w:color w:val="ABB2BF"/>
+          <w:kern w:val="0"/>
+          <w:sz w:val="21"/>
+          <w:szCs w:val="21"/>
+          <w:lang w:val="en-US" w:eastAsia="ru-RU"/>
+          <w14:ligatures w14:val="none"/>
+        </w:rPr>
+      </w:pPr>
+      <w:r>
+        <w:rPr>
+          <w:rFonts w:ascii="Consolas" w:eastAsia="Times New Roman" w:hAnsi="Consolas" w:cs="Times New Roman"/>
+          <w:color w:val="ABB2BF"/>
+          <w:kern w:val="0"/>
+          <w:sz w:val="21"/>
+          <w:szCs w:val="21"/>
+          <w:lang w:val="en-US" w:eastAsia="ru-RU"/>
+          <w14:ligatures w14:val="none"/>
+        </w:rPr>
+        <w:lastRenderedPageBreak/>
+        <w:t xml:space="preserve">        </w:t>
+      </w:r>
+      <w:r>
+        <w:rPr>
+          <w:rFonts w:ascii="Consolas" w:eastAsia="Times New Roman" w:hAnsi="Consolas" w:cs="Times New Roman"/>
+          <w:color w:val="E06C75"/>
+          <w:kern w:val="0"/>
+          <w:sz w:val="21"/>
+          <w:szCs w:val="21"/>
+          <w:lang w:val="en-US" w:eastAsia="ru-RU"/>
+          <w14:ligatures w14:val="none"/>
+        </w:rPr>
+        <w:t>uses</w:t>
+      </w:r>
+      <w:r>
+        <w:rPr>
+          <w:rFonts w:ascii="Consolas" w:eastAsia="Times New Roman" w:hAnsi="Consolas" w:cs="Times New Roman"/>
+          <w:color w:val="ABB2BF"/>
+          <w:kern w:val="0"/>
+          <w:sz w:val="21"/>
+          <w:szCs w:val="21"/>
+          <w:lang w:val="en-US" w:eastAsia="ru-RU"/>
+          <w14:ligatures w14:val="none"/>
+        </w:rPr>
+        <w:t xml:space="preserve">: </w:t>
+      </w:r>
+      <w:r>
+        <w:rPr>
+          <w:rFonts w:ascii="Consolas" w:eastAsia="Times New Roman" w:hAnsi="Consolas" w:cs="Times New Roman"/>
+          <w:color w:val="98C379"/>
+          <w:kern w:val="0"/>
+          <w:sz w:val="21"/>
+          <w:szCs w:val="21"/>
+          <w:lang w:val="en-US" w:eastAsia="ru-RU"/>
+          <w14:ligatures w14:val="none"/>
+        </w:rPr>
+        <w:t>docker/build-push-action@v6</w:t>
+      </w:r>
+    </w:p>
+    <w:p>
+      <w:pPr>
+        <w:shd w:val="clear" w:color="auto" w:fill="282C34"/>
+        <w:spacing w:after="0" w:line="285" w:lineRule="atLeast"/>
+        <w:rPr>
+          <w:rFonts w:ascii="Consolas" w:eastAsia="Times New Roman" w:hAnsi="Consolas" w:cs="Times New Roman"/>
+          <w:color w:val="ABB2BF"/>
+          <w:kern w:val="0"/>
+          <w:sz w:val="21"/>
+          <w:szCs w:val="21"/>
+          <w:lang w:val="en-US" w:eastAsia="ru-RU"/>
+          <w14:ligatures w14:val="none"/>
+        </w:rPr>
+      </w:pPr>
+      <w:r>
+        <w:rPr>
+          <w:rFonts w:ascii="Consolas" w:eastAsia="Times New Roman" w:hAnsi="Consolas" w:cs="Times New Roman"/>
+          <w:color w:val="ABB2BF"/>
+          <w:kern w:val="0"/>
+          <w:sz w:val="21"/>
+          <w:szCs w:val="21"/>
+          <w:lang w:val="en-US" w:eastAsia="ru-RU"/>
+          <w14:ligatures w14:val="none"/>
+        </w:rPr>
+        <w:t xml:space="preserve">        </w:t>
+      </w:r>
+      <w:r>
+        <w:rPr>
+          <w:rFonts w:ascii="Consolas" w:eastAsia="Times New Roman" w:hAnsi="Consolas" w:cs="Times New Roman"/>
+          <w:color w:val="E06C75"/>
+          <w:kern w:val="0"/>
+          <w:sz w:val="21"/>
+          <w:szCs w:val="21"/>
+          <w:lang w:val="en-US" w:eastAsia="ru-RU"/>
+          <w14:ligatures w14:val="none"/>
+        </w:rPr>
+        <w:t>with</w:t>
+      </w:r>
+      <w:r>
+        <w:rPr>
+          <w:rFonts w:ascii="Consolas" w:eastAsia="Times New Roman" w:hAnsi="Consolas" w:cs="Times New Roman"/>
+          <w:color w:val="ABB2BF"/>
+          <w:kern w:val="0"/>
+          <w:sz w:val="21"/>
+          <w:szCs w:val="21"/>
+          <w:lang w:val="en-US" w:eastAsia="ru-RU"/>
+          <w14:ligatures w14:val="none"/>
+        </w:rPr>
+        <w:t>:</w:t>
+      </w:r>
+    </w:p>
+    <w:p>
+      <w:pPr>
+        <w:shd w:val="clear" w:color="auto" w:fill="282C34"/>
+        <w:spacing w:after="0" w:line="285" w:lineRule="atLeast"/>
+        <w:rPr>
+          <w:rFonts w:ascii="Consolas" w:eastAsia="Times New Roman" w:hAnsi="Consolas" w:cs="Times New Roman"/>
+          <w:color w:val="ABB2BF"/>
+          <w:kern w:val="0"/>
+          <w:sz w:val="21"/>
+          <w:szCs w:val="21"/>
+          <w:lang w:val="en-US" w:eastAsia="ru-RU"/>
+          <w14:ligatures w14:val="none"/>
+        </w:rPr>
+      </w:pPr>
+      <w:r>
+        <w:rPr>
+          <w:rFonts w:ascii="Consolas" w:eastAsia="Times New Roman" w:hAnsi="Consolas" w:cs="Times New Roman"/>
+          <w:color w:val="ABB2BF"/>
+          <w:kern w:val="0"/>
+          <w:sz w:val="21"/>
+          <w:szCs w:val="21"/>
+          <w:lang w:val="en-US" w:eastAsia="ru-RU"/>
+          <w14:ligatures w14:val="none"/>
+        </w:rPr>
+        <w:t xml:space="preserve">          </w:t>
+      </w:r>
+      <w:r>
+        <w:rPr>
+          <w:rFonts w:ascii="Consolas" w:eastAsia="Times New Roman" w:hAnsi="Consolas" w:cs="Times New Roman"/>
+          <w:color w:val="E06C75"/>
+          <w:kern w:val="0"/>
+          <w:sz w:val="21"/>
+          <w:szCs w:val="21"/>
+          <w:lang w:val="en-US" w:eastAsia="ru-RU"/>
+          <w14:ligatures w14:val="none"/>
+        </w:rPr>
+        <w:t>push</w:t>
+      </w:r>
+      <w:r>
+        <w:rPr>
+          <w:rFonts w:ascii="Consolas" w:eastAsia="Times New Roman" w:hAnsi="Consolas" w:cs="Times New Roman"/>
+          <w:color w:val="ABB2BF"/>
+          <w:kern w:val="0"/>
+          <w:sz w:val="21"/>
+          <w:szCs w:val="21"/>
+          <w:lang w:val="en-US" w:eastAsia="ru-RU"/>
+          <w14:ligatures w14:val="none"/>
+        </w:rPr>
+        <w:t xml:space="preserve">: </w:t>
+      </w:r>
+      <w:r>
+        <w:rPr>
+          <w:rFonts w:ascii="Consolas" w:eastAsia="Times New Roman" w:hAnsi="Consolas" w:cs="Times New Roman"/>
+          <w:color w:val="D19A66"/>
+          <w:kern w:val="0"/>
+          <w:sz w:val="21"/>
+          <w:szCs w:val="21"/>
+          <w:lang w:val="en-US" w:eastAsia="ru-RU"/>
+          <w14:ligatures w14:val="none"/>
+        </w:rPr>
+        <w:t>true</w:t>
+      </w:r>
+    </w:p>
+    <w:p>
+      <w:pPr>
+        <w:shd w:val="clear" w:color="auto" w:fill="282C34"/>
+        <w:spacing w:after="0" w:line="285" w:lineRule="atLeast"/>
+        <w:rPr>
+          <w:rFonts w:ascii="Consolas" w:eastAsia="Times New Roman" w:hAnsi="Consolas" w:cs="Times New Roman"/>
+          <w:color w:val="ABB2BF"/>
+          <w:kern w:val="0"/>
+          <w:sz w:val="21"/>
+          <w:szCs w:val="21"/>
+          <w:lang w:val="en-US" w:eastAsia="ru-RU"/>
+          <w14:ligatures w14:val="none"/>
+        </w:rPr>
+      </w:pPr>
+      <w:r>
+        <w:rPr>
+          <w:rFonts w:ascii="Consolas" w:eastAsia="Times New Roman" w:hAnsi="Consolas" w:cs="Times New Roman"/>
+          <w:color w:val="ABB2BF"/>
+          <w:kern w:val="0"/>
+          <w:sz w:val="21"/>
+          <w:szCs w:val="21"/>
+          <w:lang w:val="en-US" w:eastAsia="ru-RU"/>
+          <w14:ligatures w14:val="none"/>
+        </w:rPr>
+        <w:t xml:space="preserve">          </w:t>
+      </w:r>
+      <w:r>
+        <w:rPr>
+          <w:rFonts w:ascii="Consolas" w:eastAsia="Times New Roman" w:hAnsi="Consolas" w:cs="Times New Roman"/>
+          <w:color w:val="E06C75"/>
+          <w:kern w:val="0"/>
+          <w:sz w:val="21"/>
+          <w:szCs w:val="21"/>
+          <w:lang w:val="en-US" w:eastAsia="ru-RU"/>
+          <w14:ligatures w14:val="none"/>
+        </w:rPr>
+        <w:t>tags</w:t>
+      </w:r>
+      <w:r>
+        <w:rPr>
+          <w:rFonts w:ascii="Consolas" w:eastAsia="Times New Roman" w:hAnsi="Consolas" w:cs="Times New Roman"/>
+          <w:color w:val="ABB2BF"/>
+          <w:kern w:val="0"/>
+          <w:sz w:val="21"/>
+          <w:szCs w:val="21"/>
+          <w:lang w:val="en-US" w:eastAsia="ru-RU"/>
+          <w14:ligatures w14:val="none"/>
+        </w:rPr>
+        <w:t xml:space="preserve">: </w:t>
+      </w:r>
+      <w:r>
+        <w:rPr>
+          <w:rFonts w:ascii="Consolas" w:eastAsia="Times New Roman" w:hAnsi="Consolas" w:cs="Times New Roman"/>
+          <w:color w:val="98C379"/>
+          <w:kern w:val="0"/>
+          <w:sz w:val="21"/>
+          <w:szCs w:val="21"/>
+          <w:lang w:val="en-US" w:eastAsia="ru-RU"/>
+          <w14:ligatures w14:val="none"/>
+        </w:rPr>
         <w:t>$</w:t>
       </w:r>
       <w:proofErr w:type="gramStart"/>
@@ -5997,7 +6583,7 @@
           <w:lang w:val="en-US" w:eastAsia="ru-RU"/>
           <w14:ligatures w14:val="none"/>
         </w:rPr>
-        <w:t>github</w:t>
+        <w:t>vars</w:t>
       </w:r>
       <w:proofErr w:type="gramEnd"/>
       <w:r>
@@ -6010,7 +6596,7 @@
           <w:lang w:val="en-US" w:eastAsia="ru-RU"/>
           <w14:ligatures w14:val="none"/>
         </w:rPr>
-        <w:t>.</w:t>
+        <w:t>.DOCKERHUB_</w:t>
       </w:r>
       <w:proofErr w:type="gramStart"/>
       <w:r>
@@ -6023,8 +6609,22 @@
           <w:lang w:val="en-US" w:eastAsia="ru-RU"/>
           <w14:ligatures w14:val="none"/>
         </w:rPr>
-        <w:t>event.workflow</w:t>
-      </w:r>
+        <w:t>USERNAME</w:t>
+      </w:r>
+      <w:proofErr w:type="spellEnd"/>
+      <w:r>
+        <w:rPr>
+          <w:rFonts w:ascii="Consolas" w:eastAsia="Times New Roman" w:hAnsi="Consolas" w:cs="Times New Roman"/>
+          <w:color w:val="98C379"/>
+          <w:kern w:val="0"/>
+          <w:sz w:val="21"/>
+          <w:szCs w:val="21"/>
+          <w:lang w:val="en-US" w:eastAsia="ru-RU"/>
+          <w14:ligatures w14:val="none"/>
+        </w:rPr>
+        <w:t xml:space="preserve"> }}/</w:t>
+      </w:r>
+      <w:proofErr w:type="spellStart"/>
       <w:proofErr w:type="gramEnd"/>
       <w:r>
         <w:rPr>
@@ -6036,7 +6636,7 @@
           <w:lang w:val="en-US" w:eastAsia="ru-RU"/>
           <w14:ligatures w14:val="none"/>
         </w:rPr>
-        <w:t>_</w:t>
+        <w:t>my-</w:t>
       </w:r>
       <w:proofErr w:type="gramStart"/>
       <w:r>
@@ -6049,998 +6649,10 @@
           <w:lang w:val="en-US" w:eastAsia="ru-RU"/>
           <w14:ligatures w14:val="none"/>
         </w:rPr>
-        <w:t>run.conclusion</w:t>
+        <w:t>app:latest</w:t>
       </w:r>
       <w:proofErr w:type="spellEnd"/>
       <w:proofErr w:type="gramEnd"/>
-      <w:r>
-        <w:rPr>
-          <w:rFonts w:ascii="Consolas" w:eastAsia="Times New Roman" w:hAnsi="Consolas" w:cs="Times New Roman"/>
-          <w:color w:val="98C379"/>
-          <w:kern w:val="0"/>
-          <w:sz w:val="21"/>
-          <w:szCs w:val="21"/>
-          <w:lang w:val="en-US" w:eastAsia="ru-RU"/>
-          <w14:ligatures w14:val="none"/>
-        </w:rPr>
-        <w:t xml:space="preserve"> == 'success</w:t>
-      </w:r>
-      <w:proofErr w:type="gramStart"/>
-      <w:r>
-        <w:rPr>
-          <w:rFonts w:ascii="Consolas" w:eastAsia="Times New Roman" w:hAnsi="Consolas" w:cs="Times New Roman"/>
-          <w:color w:val="98C379"/>
-          <w:kern w:val="0"/>
-          <w:sz w:val="21"/>
-          <w:szCs w:val="21"/>
-          <w:lang w:val="en-US" w:eastAsia="ru-RU"/>
-          <w14:ligatures w14:val="none"/>
-        </w:rPr>
-        <w:t>' }</w:t>
-      </w:r>
-      <w:proofErr w:type="gramEnd"/>
-      <w:r>
-        <w:rPr>
-          <w:rFonts w:ascii="Consolas" w:eastAsia="Times New Roman" w:hAnsi="Consolas" w:cs="Times New Roman"/>
-          <w:color w:val="98C379"/>
-          <w:kern w:val="0"/>
-          <w:sz w:val="21"/>
-          <w:szCs w:val="21"/>
-          <w:lang w:val="en-US" w:eastAsia="ru-RU"/>
-          <w14:ligatures w14:val="none"/>
-        </w:rPr>
-        <w:t>}</w:t>
-      </w:r>
-    </w:p>
-    <w:p>
-      <w:pPr>
-        <w:shd w:val="clear" w:color="auto" w:fill="282C34"/>
-        <w:spacing w:after="0" w:line="285" w:lineRule="atLeast"/>
-        <w:rPr>
-          <w:rFonts w:ascii="Consolas" w:eastAsia="Times New Roman" w:hAnsi="Consolas" w:cs="Times New Roman"/>
-          <w:color w:val="ABB2BF"/>
-          <w:kern w:val="0"/>
-          <w:sz w:val="21"/>
-          <w:szCs w:val="21"/>
-          <w:lang w:val="en-US" w:eastAsia="ru-RU"/>
-          <w14:ligatures w14:val="none"/>
-        </w:rPr>
-      </w:pPr>
-    </w:p>
-    <w:p>
-      <w:pPr>
-        <w:shd w:val="clear" w:color="auto" w:fill="282C34"/>
-        <w:spacing w:after="0" w:line="285" w:lineRule="atLeast"/>
-        <w:rPr>
-          <w:rFonts w:ascii="Consolas" w:eastAsia="Times New Roman" w:hAnsi="Consolas" w:cs="Times New Roman"/>
-          <w:color w:val="ABB2BF"/>
-          <w:kern w:val="0"/>
-          <w:sz w:val="21"/>
-          <w:szCs w:val="21"/>
-          <w:lang w:val="en-US" w:eastAsia="ru-RU"/>
-          <w14:ligatures w14:val="none"/>
-        </w:rPr>
-      </w:pPr>
-      <w:r>
-        <w:rPr>
-          <w:rFonts w:ascii="Consolas" w:eastAsia="Times New Roman" w:hAnsi="Consolas" w:cs="Times New Roman"/>
-          <w:color w:val="ABB2BF"/>
-          <w:kern w:val="0"/>
-          <w:sz w:val="21"/>
-          <w:szCs w:val="21"/>
-          <w:lang w:val="en-US" w:eastAsia="ru-RU"/>
-          <w14:ligatures w14:val="none"/>
-        </w:rPr>
-        <w:lastRenderedPageBreak/>
-        <w:t xml:space="preserve">    </w:t>
-      </w:r>
-      <w:r>
-        <w:rPr>
-          <w:rFonts w:ascii="Consolas" w:eastAsia="Times New Roman" w:hAnsi="Consolas" w:cs="Times New Roman"/>
-          <w:color w:val="E06C75"/>
-          <w:kern w:val="0"/>
-          <w:sz w:val="21"/>
-          <w:szCs w:val="21"/>
-          <w:lang w:val="en-US" w:eastAsia="ru-RU"/>
-          <w14:ligatures w14:val="none"/>
-        </w:rPr>
-        <w:t>steps</w:t>
-      </w:r>
-      <w:r>
-        <w:rPr>
-          <w:rFonts w:ascii="Consolas" w:eastAsia="Times New Roman" w:hAnsi="Consolas" w:cs="Times New Roman"/>
-          <w:color w:val="ABB2BF"/>
-          <w:kern w:val="0"/>
-          <w:sz w:val="21"/>
-          <w:szCs w:val="21"/>
-          <w:lang w:val="en-US" w:eastAsia="ru-RU"/>
-          <w14:ligatures w14:val="none"/>
-        </w:rPr>
-        <w:t>:</w:t>
-      </w:r>
-    </w:p>
-    <w:p>
-      <w:pPr>
-        <w:shd w:val="clear" w:color="auto" w:fill="282C34"/>
-        <w:spacing w:after="0" w:line="285" w:lineRule="atLeast"/>
-        <w:rPr>
-          <w:rFonts w:ascii="Consolas" w:eastAsia="Times New Roman" w:hAnsi="Consolas" w:cs="Times New Roman"/>
-          <w:color w:val="ABB2BF"/>
-          <w:kern w:val="0"/>
-          <w:sz w:val="21"/>
-          <w:szCs w:val="21"/>
-          <w:lang w:val="en-US" w:eastAsia="ru-RU"/>
-          <w14:ligatures w14:val="none"/>
-        </w:rPr>
-      </w:pPr>
-      <w:r>
-        <w:rPr>
-          <w:rFonts w:ascii="Consolas" w:eastAsia="Times New Roman" w:hAnsi="Consolas" w:cs="Times New Roman"/>
-          <w:color w:val="ABB2BF"/>
-          <w:kern w:val="0"/>
-          <w:sz w:val="21"/>
-          <w:szCs w:val="21"/>
-          <w:lang w:val="en-US" w:eastAsia="ru-RU"/>
-          <w14:ligatures w14:val="none"/>
-        </w:rPr>
-        <w:t xml:space="preserve">      - </w:t>
-      </w:r>
-      <w:r>
-        <w:rPr>
-          <w:rFonts w:ascii="Consolas" w:eastAsia="Times New Roman" w:hAnsi="Consolas" w:cs="Times New Roman"/>
-          <w:color w:val="E06C75"/>
-          <w:kern w:val="0"/>
-          <w:sz w:val="21"/>
-          <w:szCs w:val="21"/>
-          <w:lang w:val="en-US" w:eastAsia="ru-RU"/>
-          <w14:ligatures w14:val="none"/>
-        </w:rPr>
-        <w:t>name</w:t>
-      </w:r>
-      <w:r>
-        <w:rPr>
-          <w:rFonts w:ascii="Consolas" w:eastAsia="Times New Roman" w:hAnsi="Consolas" w:cs="Times New Roman"/>
-          <w:color w:val="ABB2BF"/>
-          <w:kern w:val="0"/>
-          <w:sz w:val="21"/>
-          <w:szCs w:val="21"/>
-          <w:lang w:val="en-US" w:eastAsia="ru-RU"/>
-          <w14:ligatures w14:val="none"/>
-        </w:rPr>
-        <w:t xml:space="preserve">: </w:t>
-      </w:r>
-      <w:r>
-        <w:rPr>
-          <w:rFonts w:ascii="Consolas" w:eastAsia="Times New Roman" w:hAnsi="Consolas" w:cs="Times New Roman"/>
-          <w:color w:val="98C379"/>
-          <w:kern w:val="0"/>
-          <w:sz w:val="21"/>
-          <w:szCs w:val="21"/>
-          <w:lang w:val="en-US" w:eastAsia="ru-RU"/>
-          <w14:ligatures w14:val="none"/>
-        </w:rPr>
-        <w:t>Login to Docker Hub</w:t>
-      </w:r>
-    </w:p>
-    <w:p>
-      <w:pPr>
-        <w:shd w:val="clear" w:color="auto" w:fill="282C34"/>
-        <w:spacing w:after="0" w:line="285" w:lineRule="atLeast"/>
-        <w:rPr>
-          <w:rFonts w:ascii="Consolas" w:eastAsia="Times New Roman" w:hAnsi="Consolas" w:cs="Times New Roman"/>
-          <w:color w:val="ABB2BF"/>
-          <w:kern w:val="0"/>
-          <w:sz w:val="21"/>
-          <w:szCs w:val="21"/>
-          <w:lang w:val="en-US" w:eastAsia="ru-RU"/>
-          <w14:ligatures w14:val="none"/>
-        </w:rPr>
-      </w:pPr>
-      <w:r>
-        <w:rPr>
-          <w:rFonts w:ascii="Consolas" w:eastAsia="Times New Roman" w:hAnsi="Consolas" w:cs="Times New Roman"/>
-          <w:color w:val="ABB2BF"/>
-          <w:kern w:val="0"/>
-          <w:sz w:val="21"/>
-          <w:szCs w:val="21"/>
-          <w:lang w:val="en-US" w:eastAsia="ru-RU"/>
-          <w14:ligatures w14:val="none"/>
-        </w:rPr>
-        <w:t xml:space="preserve">        </w:t>
-      </w:r>
-      <w:r>
-        <w:rPr>
-          <w:rFonts w:ascii="Consolas" w:eastAsia="Times New Roman" w:hAnsi="Consolas" w:cs="Times New Roman"/>
-          <w:color w:val="E06C75"/>
-          <w:kern w:val="0"/>
-          <w:sz w:val="21"/>
-          <w:szCs w:val="21"/>
-          <w:lang w:val="en-US" w:eastAsia="ru-RU"/>
-          <w14:ligatures w14:val="none"/>
-        </w:rPr>
-        <w:t>uses</w:t>
-      </w:r>
-      <w:r>
-        <w:rPr>
-          <w:rFonts w:ascii="Consolas" w:eastAsia="Times New Roman" w:hAnsi="Consolas" w:cs="Times New Roman"/>
-          <w:color w:val="ABB2BF"/>
-          <w:kern w:val="0"/>
-          <w:sz w:val="21"/>
-          <w:szCs w:val="21"/>
-          <w:lang w:val="en-US" w:eastAsia="ru-RU"/>
-          <w14:ligatures w14:val="none"/>
-        </w:rPr>
-        <w:t xml:space="preserve">: </w:t>
-      </w:r>
-      <w:r>
-        <w:rPr>
-          <w:rFonts w:ascii="Consolas" w:eastAsia="Times New Roman" w:hAnsi="Consolas" w:cs="Times New Roman"/>
-          <w:color w:val="98C379"/>
-          <w:kern w:val="0"/>
-          <w:sz w:val="21"/>
-          <w:szCs w:val="21"/>
-          <w:lang w:val="en-US" w:eastAsia="ru-RU"/>
-          <w14:ligatures w14:val="none"/>
-        </w:rPr>
-        <w:t>docker/login-action@v3</w:t>
-      </w:r>
-    </w:p>
-    <w:p>
-      <w:pPr>
-        <w:shd w:val="clear" w:color="auto" w:fill="282C34"/>
-        <w:spacing w:after="0" w:line="285" w:lineRule="atLeast"/>
-        <w:rPr>
-          <w:rFonts w:ascii="Consolas" w:eastAsia="Times New Roman" w:hAnsi="Consolas" w:cs="Times New Roman"/>
-          <w:color w:val="ABB2BF"/>
-          <w:kern w:val="0"/>
-          <w:sz w:val="21"/>
-          <w:szCs w:val="21"/>
-          <w:lang w:val="en-US" w:eastAsia="ru-RU"/>
-          <w14:ligatures w14:val="none"/>
-        </w:rPr>
-      </w:pPr>
-      <w:r>
-        <w:rPr>
-          <w:rFonts w:ascii="Consolas" w:eastAsia="Times New Roman" w:hAnsi="Consolas" w:cs="Times New Roman"/>
-          <w:color w:val="ABB2BF"/>
-          <w:kern w:val="0"/>
-          <w:sz w:val="21"/>
-          <w:szCs w:val="21"/>
-          <w:lang w:val="en-US" w:eastAsia="ru-RU"/>
-          <w14:ligatures w14:val="none"/>
-        </w:rPr>
-        <w:t xml:space="preserve">        </w:t>
-      </w:r>
-      <w:r>
-        <w:rPr>
-          <w:rFonts w:ascii="Consolas" w:eastAsia="Times New Roman" w:hAnsi="Consolas" w:cs="Times New Roman"/>
-          <w:color w:val="E06C75"/>
-          <w:kern w:val="0"/>
-          <w:sz w:val="21"/>
-          <w:szCs w:val="21"/>
-          <w:lang w:val="en-US" w:eastAsia="ru-RU"/>
-          <w14:ligatures w14:val="none"/>
-        </w:rPr>
-        <w:t>with</w:t>
-      </w:r>
-      <w:r>
-        <w:rPr>
-          <w:rFonts w:ascii="Consolas" w:eastAsia="Times New Roman" w:hAnsi="Consolas" w:cs="Times New Roman"/>
-          <w:color w:val="ABB2BF"/>
-          <w:kern w:val="0"/>
-          <w:sz w:val="21"/>
-          <w:szCs w:val="21"/>
-          <w:lang w:val="en-US" w:eastAsia="ru-RU"/>
-          <w14:ligatures w14:val="none"/>
-        </w:rPr>
-        <w:t>:</w:t>
-      </w:r>
-    </w:p>
-    <w:p>
-      <w:pPr>
-        <w:shd w:val="clear" w:color="auto" w:fill="282C34"/>
-        <w:spacing w:after="0" w:line="285" w:lineRule="atLeast"/>
-        <w:rPr>
-          <w:rFonts w:ascii="Consolas" w:eastAsia="Times New Roman" w:hAnsi="Consolas" w:cs="Times New Roman"/>
-          <w:color w:val="ABB2BF"/>
-          <w:kern w:val="0"/>
-          <w:sz w:val="21"/>
-          <w:szCs w:val="21"/>
-          <w:lang w:val="en-US" w:eastAsia="ru-RU"/>
-          <w14:ligatures w14:val="none"/>
-        </w:rPr>
-      </w:pPr>
-      <w:r>
-        <w:rPr>
-          <w:rFonts w:ascii="Consolas" w:eastAsia="Times New Roman" w:hAnsi="Consolas" w:cs="Times New Roman"/>
-          <w:color w:val="ABB2BF"/>
-          <w:kern w:val="0"/>
-          <w:sz w:val="21"/>
-          <w:szCs w:val="21"/>
-          <w:lang w:val="en-US" w:eastAsia="ru-RU"/>
-          <w14:ligatures w14:val="none"/>
-        </w:rPr>
-        <w:t xml:space="preserve">          </w:t>
-      </w:r>
-      <w:r>
-        <w:rPr>
-          <w:rFonts w:ascii="Consolas" w:eastAsia="Times New Roman" w:hAnsi="Consolas" w:cs="Times New Roman"/>
-          <w:color w:val="E06C75"/>
-          <w:kern w:val="0"/>
-          <w:sz w:val="21"/>
-          <w:szCs w:val="21"/>
-          <w:lang w:val="en-US" w:eastAsia="ru-RU"/>
-          <w14:ligatures w14:val="none"/>
-        </w:rPr>
-        <w:t>username</w:t>
-      </w:r>
-      <w:r>
-        <w:rPr>
-          <w:rFonts w:ascii="Consolas" w:eastAsia="Times New Roman" w:hAnsi="Consolas" w:cs="Times New Roman"/>
-          <w:color w:val="ABB2BF"/>
-          <w:kern w:val="0"/>
-          <w:sz w:val="21"/>
-          <w:szCs w:val="21"/>
-          <w:lang w:val="en-US" w:eastAsia="ru-RU"/>
-          <w14:ligatures w14:val="none"/>
-        </w:rPr>
-        <w:t xml:space="preserve">: </w:t>
-      </w:r>
-      <w:r>
-        <w:rPr>
-          <w:rFonts w:ascii="Consolas" w:eastAsia="Times New Roman" w:hAnsi="Consolas" w:cs="Times New Roman"/>
-          <w:color w:val="98C379"/>
-          <w:kern w:val="0"/>
-          <w:sz w:val="21"/>
-          <w:szCs w:val="21"/>
-          <w:lang w:val="en-US" w:eastAsia="ru-RU"/>
-          <w14:ligatures w14:val="none"/>
-        </w:rPr>
-        <w:t>$</w:t>
-      </w:r>
-      <w:proofErr w:type="gramStart"/>
-      <w:r>
-        <w:rPr>
-          <w:rFonts w:ascii="Consolas" w:eastAsia="Times New Roman" w:hAnsi="Consolas" w:cs="Times New Roman"/>
-          <w:color w:val="98C379"/>
-          <w:kern w:val="0"/>
-          <w:sz w:val="21"/>
-          <w:szCs w:val="21"/>
-          <w:lang w:val="en-US" w:eastAsia="ru-RU"/>
-          <w14:ligatures w14:val="none"/>
-        </w:rPr>
-        <w:t xml:space="preserve">{{ </w:t>
-      </w:r>
-      <w:proofErr w:type="spellStart"/>
-      <w:r>
-        <w:rPr>
-          <w:rFonts w:ascii="Consolas" w:eastAsia="Times New Roman" w:hAnsi="Consolas" w:cs="Times New Roman"/>
-          <w:color w:val="98C379"/>
-          <w:kern w:val="0"/>
-          <w:sz w:val="21"/>
-          <w:szCs w:val="21"/>
-          <w:lang w:val="en-US" w:eastAsia="ru-RU"/>
-          <w14:ligatures w14:val="none"/>
-        </w:rPr>
-        <w:t>vars</w:t>
-      </w:r>
-      <w:proofErr w:type="gramEnd"/>
-      <w:r>
-        <w:rPr>
-          <w:rFonts w:ascii="Consolas" w:eastAsia="Times New Roman" w:hAnsi="Consolas" w:cs="Times New Roman"/>
-          <w:color w:val="98C379"/>
-          <w:kern w:val="0"/>
-          <w:sz w:val="21"/>
-          <w:szCs w:val="21"/>
-          <w:lang w:val="en-US" w:eastAsia="ru-RU"/>
-          <w14:ligatures w14:val="none"/>
-        </w:rPr>
-        <w:t>.DOCKERHUB_</w:t>
-      </w:r>
-      <w:proofErr w:type="gramStart"/>
-      <w:r>
-        <w:rPr>
-          <w:rFonts w:ascii="Consolas" w:eastAsia="Times New Roman" w:hAnsi="Consolas" w:cs="Times New Roman"/>
-          <w:color w:val="98C379"/>
-          <w:kern w:val="0"/>
-          <w:sz w:val="21"/>
-          <w:szCs w:val="21"/>
-          <w:lang w:val="en-US" w:eastAsia="ru-RU"/>
-          <w14:ligatures w14:val="none"/>
-        </w:rPr>
-        <w:t>USERNAME</w:t>
-      </w:r>
-      <w:proofErr w:type="spellEnd"/>
-      <w:r>
-        <w:rPr>
-          <w:rFonts w:ascii="Consolas" w:eastAsia="Times New Roman" w:hAnsi="Consolas" w:cs="Times New Roman"/>
-          <w:color w:val="98C379"/>
-          <w:kern w:val="0"/>
-          <w:sz w:val="21"/>
-          <w:szCs w:val="21"/>
-          <w:lang w:val="en-US" w:eastAsia="ru-RU"/>
-          <w14:ligatures w14:val="none"/>
-        </w:rPr>
-        <w:t xml:space="preserve"> }</w:t>
-      </w:r>
-      <w:proofErr w:type="gramEnd"/>
-      <w:r>
-        <w:rPr>
-          <w:rFonts w:ascii="Consolas" w:eastAsia="Times New Roman" w:hAnsi="Consolas" w:cs="Times New Roman"/>
-          <w:color w:val="98C379"/>
-          <w:kern w:val="0"/>
-          <w:sz w:val="21"/>
-          <w:szCs w:val="21"/>
-          <w:lang w:val="en-US" w:eastAsia="ru-RU"/>
-          <w14:ligatures w14:val="none"/>
-        </w:rPr>
-        <w:t>}</w:t>
-      </w:r>
-    </w:p>
-    <w:p>
-      <w:pPr>
-        <w:shd w:val="clear" w:color="auto" w:fill="282C34"/>
-        <w:spacing w:after="0" w:line="285" w:lineRule="atLeast"/>
-        <w:rPr>
-          <w:rFonts w:ascii="Consolas" w:eastAsia="Times New Roman" w:hAnsi="Consolas" w:cs="Times New Roman"/>
-          <w:color w:val="ABB2BF"/>
-          <w:kern w:val="0"/>
-          <w:sz w:val="21"/>
-          <w:szCs w:val="21"/>
-          <w:lang w:val="en-US" w:eastAsia="ru-RU"/>
-          <w14:ligatures w14:val="none"/>
-        </w:rPr>
-      </w:pPr>
-      <w:r>
-        <w:rPr>
-          <w:rFonts w:ascii="Consolas" w:eastAsia="Times New Roman" w:hAnsi="Consolas" w:cs="Times New Roman"/>
-          <w:color w:val="ABB2BF"/>
-          <w:kern w:val="0"/>
-          <w:sz w:val="21"/>
-          <w:szCs w:val="21"/>
-          <w:lang w:val="en-US" w:eastAsia="ru-RU"/>
-          <w14:ligatures w14:val="none"/>
-        </w:rPr>
-        <w:t xml:space="preserve">          </w:t>
-      </w:r>
-      <w:r>
-        <w:rPr>
-          <w:rFonts w:ascii="Consolas" w:eastAsia="Times New Roman" w:hAnsi="Consolas" w:cs="Times New Roman"/>
-          <w:color w:val="E06C75"/>
-          <w:kern w:val="0"/>
-          <w:sz w:val="21"/>
-          <w:szCs w:val="21"/>
-          <w:lang w:val="en-US" w:eastAsia="ru-RU"/>
-          <w14:ligatures w14:val="none"/>
-        </w:rPr>
-        <w:t>password</w:t>
-      </w:r>
-      <w:r>
-        <w:rPr>
-          <w:rFonts w:ascii="Consolas" w:eastAsia="Times New Roman" w:hAnsi="Consolas" w:cs="Times New Roman"/>
-          <w:color w:val="ABB2BF"/>
-          <w:kern w:val="0"/>
-          <w:sz w:val="21"/>
-          <w:szCs w:val="21"/>
-          <w:lang w:val="en-US" w:eastAsia="ru-RU"/>
-          <w14:ligatures w14:val="none"/>
-        </w:rPr>
-        <w:t xml:space="preserve">: </w:t>
-      </w:r>
-      <w:r>
-        <w:rPr>
-          <w:rFonts w:ascii="Consolas" w:eastAsia="Times New Roman" w:hAnsi="Consolas" w:cs="Times New Roman"/>
-          <w:color w:val="98C379"/>
-          <w:kern w:val="0"/>
-          <w:sz w:val="21"/>
-          <w:szCs w:val="21"/>
-          <w:lang w:val="en-US" w:eastAsia="ru-RU"/>
-          <w14:ligatures w14:val="none"/>
-        </w:rPr>
-        <w:t>$</w:t>
-      </w:r>
-      <w:proofErr w:type="gramStart"/>
-      <w:r>
-        <w:rPr>
-          <w:rFonts w:ascii="Consolas" w:eastAsia="Times New Roman" w:hAnsi="Consolas" w:cs="Times New Roman"/>
-          <w:color w:val="98C379"/>
-          <w:kern w:val="0"/>
-          <w:sz w:val="21"/>
-          <w:szCs w:val="21"/>
-          <w:lang w:val="en-US" w:eastAsia="ru-RU"/>
-          <w14:ligatures w14:val="none"/>
-        </w:rPr>
-        <w:t xml:space="preserve">{{ </w:t>
-      </w:r>
-      <w:proofErr w:type="spellStart"/>
-      <w:r>
-        <w:rPr>
-          <w:rFonts w:ascii="Consolas" w:eastAsia="Times New Roman" w:hAnsi="Consolas" w:cs="Times New Roman"/>
-          <w:color w:val="98C379"/>
-          <w:kern w:val="0"/>
-          <w:sz w:val="21"/>
-          <w:szCs w:val="21"/>
-          <w:lang w:val="en-US" w:eastAsia="ru-RU"/>
-          <w14:ligatures w14:val="none"/>
-        </w:rPr>
-        <w:t>secrets</w:t>
-      </w:r>
-      <w:proofErr w:type="gramEnd"/>
-      <w:r>
-        <w:rPr>
-          <w:rFonts w:ascii="Consolas" w:eastAsia="Times New Roman" w:hAnsi="Consolas" w:cs="Times New Roman"/>
-          <w:color w:val="98C379"/>
-          <w:kern w:val="0"/>
-          <w:sz w:val="21"/>
-          <w:szCs w:val="21"/>
-          <w:lang w:val="en-US" w:eastAsia="ru-RU"/>
-          <w14:ligatures w14:val="none"/>
-        </w:rPr>
-        <w:t>.DOCKERHUB_</w:t>
-      </w:r>
-      <w:proofErr w:type="gramStart"/>
-      <w:r>
-        <w:rPr>
-          <w:rFonts w:ascii="Consolas" w:eastAsia="Times New Roman" w:hAnsi="Consolas" w:cs="Times New Roman"/>
-          <w:color w:val="98C379"/>
-          <w:kern w:val="0"/>
-          <w:sz w:val="21"/>
-          <w:szCs w:val="21"/>
-          <w:lang w:val="en-US" w:eastAsia="ru-RU"/>
-          <w14:ligatures w14:val="none"/>
-        </w:rPr>
-        <w:t>TOKEN</w:t>
-      </w:r>
-      <w:proofErr w:type="spellEnd"/>
-      <w:r>
-        <w:rPr>
-          <w:rFonts w:ascii="Consolas" w:eastAsia="Times New Roman" w:hAnsi="Consolas" w:cs="Times New Roman"/>
-          <w:color w:val="98C379"/>
-          <w:kern w:val="0"/>
-          <w:sz w:val="21"/>
-          <w:szCs w:val="21"/>
-          <w:lang w:val="en-US" w:eastAsia="ru-RU"/>
-          <w14:ligatures w14:val="none"/>
-        </w:rPr>
-        <w:t xml:space="preserve"> }</w:t>
-      </w:r>
-      <w:proofErr w:type="gramEnd"/>
-      <w:r>
-        <w:rPr>
-          <w:rFonts w:ascii="Consolas" w:eastAsia="Times New Roman" w:hAnsi="Consolas" w:cs="Times New Roman"/>
-          <w:color w:val="98C379"/>
-          <w:kern w:val="0"/>
-          <w:sz w:val="21"/>
-          <w:szCs w:val="21"/>
-          <w:lang w:val="en-US" w:eastAsia="ru-RU"/>
-          <w14:ligatures w14:val="none"/>
-        </w:rPr>
-        <w:t>}</w:t>
-      </w:r>
-    </w:p>
-    <w:p>
-      <w:pPr>
-        <w:shd w:val="clear" w:color="auto" w:fill="282C34"/>
-        <w:spacing w:after="0" w:line="285" w:lineRule="atLeast"/>
-        <w:rPr>
-          <w:rFonts w:ascii="Consolas" w:eastAsia="Times New Roman" w:hAnsi="Consolas" w:cs="Times New Roman"/>
-          <w:color w:val="ABB2BF"/>
-          <w:kern w:val="0"/>
-          <w:sz w:val="21"/>
-          <w:szCs w:val="21"/>
-          <w:lang w:val="en-US" w:eastAsia="ru-RU"/>
-          <w14:ligatures w14:val="none"/>
-        </w:rPr>
-      </w:pPr>
-      <w:r>
-        <w:rPr>
-          <w:rFonts w:ascii="Consolas" w:eastAsia="Times New Roman" w:hAnsi="Consolas" w:cs="Times New Roman"/>
-          <w:color w:val="ABB2BF"/>
-          <w:kern w:val="0"/>
-          <w:sz w:val="21"/>
-          <w:szCs w:val="21"/>
-          <w:lang w:val="en-US" w:eastAsia="ru-RU"/>
-          <w14:ligatures w14:val="none"/>
-        </w:rPr>
-        <w:t xml:space="preserve">          </w:t>
-      </w:r>
-    </w:p>
-    <w:p>
-      <w:pPr>
-        <w:shd w:val="clear" w:color="auto" w:fill="282C34"/>
-        <w:spacing w:after="0" w:line="285" w:lineRule="atLeast"/>
-        <w:rPr>
-          <w:rFonts w:ascii="Consolas" w:eastAsia="Times New Roman" w:hAnsi="Consolas" w:cs="Times New Roman"/>
-          <w:color w:val="ABB2BF"/>
-          <w:kern w:val="0"/>
-          <w:sz w:val="21"/>
-          <w:szCs w:val="21"/>
-          <w:lang w:val="en-US" w:eastAsia="ru-RU"/>
-          <w14:ligatures w14:val="none"/>
-        </w:rPr>
-      </w:pPr>
-      <w:r>
-        <w:rPr>
-          <w:rFonts w:ascii="Consolas" w:eastAsia="Times New Roman" w:hAnsi="Consolas" w:cs="Times New Roman"/>
-          <w:color w:val="ABB2BF"/>
-          <w:kern w:val="0"/>
-          <w:sz w:val="21"/>
-          <w:szCs w:val="21"/>
-          <w:lang w:val="en-US" w:eastAsia="ru-RU"/>
-          <w14:ligatures w14:val="none"/>
-        </w:rPr>
-        <w:t xml:space="preserve">      - </w:t>
-      </w:r>
-      <w:r>
-        <w:rPr>
-          <w:rFonts w:ascii="Consolas" w:eastAsia="Times New Roman" w:hAnsi="Consolas" w:cs="Times New Roman"/>
-          <w:color w:val="E06C75"/>
-          <w:kern w:val="0"/>
-          <w:sz w:val="21"/>
-          <w:szCs w:val="21"/>
-          <w:lang w:val="en-US" w:eastAsia="ru-RU"/>
-          <w14:ligatures w14:val="none"/>
-        </w:rPr>
-        <w:t>name</w:t>
-      </w:r>
-      <w:r>
-        <w:rPr>
-          <w:rFonts w:ascii="Consolas" w:eastAsia="Times New Roman" w:hAnsi="Consolas" w:cs="Times New Roman"/>
-          <w:color w:val="ABB2BF"/>
-          <w:kern w:val="0"/>
-          <w:sz w:val="21"/>
-          <w:szCs w:val="21"/>
-          <w:lang w:val="en-US" w:eastAsia="ru-RU"/>
-          <w14:ligatures w14:val="none"/>
-        </w:rPr>
-        <w:t xml:space="preserve">: </w:t>
-      </w:r>
-      <w:r>
-        <w:rPr>
-          <w:rFonts w:ascii="Consolas" w:eastAsia="Times New Roman" w:hAnsi="Consolas" w:cs="Times New Roman"/>
-          <w:color w:val="98C379"/>
-          <w:kern w:val="0"/>
-          <w:sz w:val="21"/>
-          <w:szCs w:val="21"/>
-          <w:lang w:val="en-US" w:eastAsia="ru-RU"/>
-          <w14:ligatures w14:val="none"/>
-        </w:rPr>
-        <w:t>Build and push image</w:t>
-      </w:r>
-    </w:p>
-    <w:p>
-      <w:pPr>
-        <w:shd w:val="clear" w:color="auto" w:fill="282C34"/>
-        <w:spacing w:after="0" w:line="285" w:lineRule="atLeast"/>
-        <w:rPr>
-          <w:rFonts w:ascii="Consolas" w:eastAsia="Times New Roman" w:hAnsi="Consolas" w:cs="Times New Roman"/>
-          <w:color w:val="ABB2BF"/>
-          <w:kern w:val="0"/>
-          <w:sz w:val="21"/>
-          <w:szCs w:val="21"/>
-          <w:lang w:val="en-US" w:eastAsia="ru-RU"/>
-          <w14:ligatures w14:val="none"/>
-        </w:rPr>
-      </w:pPr>
-      <w:r>
-        <w:rPr>
-          <w:rFonts w:ascii="Consolas" w:eastAsia="Times New Roman" w:hAnsi="Consolas" w:cs="Times New Roman"/>
-          <w:color w:val="ABB2BF"/>
-          <w:kern w:val="0"/>
-          <w:sz w:val="21"/>
-          <w:szCs w:val="21"/>
-          <w:lang w:val="en-US" w:eastAsia="ru-RU"/>
-          <w14:ligatures w14:val="none"/>
-        </w:rPr>
-        <w:t xml:space="preserve">        </w:t>
-      </w:r>
-      <w:r>
-        <w:rPr>
-          <w:rFonts w:ascii="Consolas" w:eastAsia="Times New Roman" w:hAnsi="Consolas" w:cs="Times New Roman"/>
-          <w:color w:val="E06C75"/>
-          <w:kern w:val="0"/>
-          <w:sz w:val="21"/>
-          <w:szCs w:val="21"/>
-          <w:lang w:val="en-US" w:eastAsia="ru-RU"/>
-          <w14:ligatures w14:val="none"/>
-        </w:rPr>
-        <w:t>uses</w:t>
-      </w:r>
-      <w:r>
-        <w:rPr>
-          <w:rFonts w:ascii="Consolas" w:eastAsia="Times New Roman" w:hAnsi="Consolas" w:cs="Times New Roman"/>
-          <w:color w:val="ABB2BF"/>
-          <w:kern w:val="0"/>
-          <w:sz w:val="21"/>
-          <w:szCs w:val="21"/>
-          <w:lang w:val="en-US" w:eastAsia="ru-RU"/>
-          <w14:ligatures w14:val="none"/>
-        </w:rPr>
-        <w:t xml:space="preserve">: </w:t>
-      </w:r>
-      <w:r>
-        <w:rPr>
-          <w:rFonts w:ascii="Consolas" w:eastAsia="Times New Roman" w:hAnsi="Consolas" w:cs="Times New Roman"/>
-          <w:color w:val="98C379"/>
-          <w:kern w:val="0"/>
-          <w:sz w:val="21"/>
-          <w:szCs w:val="21"/>
-          <w:lang w:val="en-US" w:eastAsia="ru-RU"/>
-          <w14:ligatures w14:val="none"/>
-        </w:rPr>
-        <w:t>docker/build-push-action@v6</w:t>
-      </w:r>
-    </w:p>
-    <w:p>
-      <w:pPr>
-        <w:shd w:val="clear" w:color="auto" w:fill="282C34"/>
-        <w:spacing w:after="0" w:line="285" w:lineRule="atLeast"/>
-        <w:rPr>
-          <w:rFonts w:ascii="Consolas" w:eastAsia="Times New Roman" w:hAnsi="Consolas" w:cs="Times New Roman"/>
-          <w:color w:val="ABB2BF"/>
-          <w:kern w:val="0"/>
-          <w:sz w:val="21"/>
-          <w:szCs w:val="21"/>
-          <w:lang w:val="en-US" w:eastAsia="ru-RU"/>
-          <w14:ligatures w14:val="none"/>
-        </w:rPr>
-      </w:pPr>
-      <w:r>
-        <w:rPr>
-          <w:rFonts w:ascii="Consolas" w:eastAsia="Times New Roman" w:hAnsi="Consolas" w:cs="Times New Roman"/>
-          <w:color w:val="ABB2BF"/>
-          <w:kern w:val="0"/>
-          <w:sz w:val="21"/>
-          <w:szCs w:val="21"/>
-          <w:lang w:val="en-US" w:eastAsia="ru-RU"/>
-          <w14:ligatures w14:val="none"/>
-        </w:rPr>
-        <w:t xml:space="preserve">        </w:t>
-      </w:r>
-      <w:r>
-        <w:rPr>
-          <w:rFonts w:ascii="Consolas" w:eastAsia="Times New Roman" w:hAnsi="Consolas" w:cs="Times New Roman"/>
-          <w:color w:val="E06C75"/>
-          <w:kern w:val="0"/>
-          <w:sz w:val="21"/>
-          <w:szCs w:val="21"/>
-          <w:lang w:val="en-US" w:eastAsia="ru-RU"/>
-          <w14:ligatures w14:val="none"/>
-        </w:rPr>
-        <w:t>with</w:t>
-      </w:r>
-      <w:r>
-        <w:rPr>
-          <w:rFonts w:ascii="Consolas" w:eastAsia="Times New Roman" w:hAnsi="Consolas" w:cs="Times New Roman"/>
-          <w:color w:val="ABB2BF"/>
-          <w:kern w:val="0"/>
-          <w:sz w:val="21"/>
-          <w:szCs w:val="21"/>
-          <w:lang w:val="en-US" w:eastAsia="ru-RU"/>
-          <w14:ligatures w14:val="none"/>
-        </w:rPr>
-        <w:t>:</w:t>
-      </w:r>
-    </w:p>
-    <w:p>
-      <w:pPr>
-        <w:shd w:val="clear" w:color="auto" w:fill="282C34"/>
-        <w:spacing w:after="0" w:line="285" w:lineRule="atLeast"/>
-        <w:rPr>
-          <w:rFonts w:ascii="Consolas" w:eastAsia="Times New Roman" w:hAnsi="Consolas" w:cs="Times New Roman"/>
-          <w:color w:val="ABB2BF"/>
-          <w:kern w:val="0"/>
-          <w:sz w:val="21"/>
-          <w:szCs w:val="21"/>
-          <w:lang w:val="en-US" w:eastAsia="ru-RU"/>
-          <w14:ligatures w14:val="none"/>
-        </w:rPr>
-      </w:pPr>
-      <w:r>
-        <w:rPr>
-          <w:rFonts w:ascii="Consolas" w:eastAsia="Times New Roman" w:hAnsi="Consolas" w:cs="Times New Roman"/>
-          <w:color w:val="ABB2BF"/>
-          <w:kern w:val="0"/>
-          <w:sz w:val="21"/>
-          <w:szCs w:val="21"/>
-          <w:lang w:val="en-US" w:eastAsia="ru-RU"/>
-          <w14:ligatures w14:val="none"/>
-        </w:rPr>
-        <w:t xml:space="preserve">          </w:t>
-      </w:r>
-      <w:r>
-        <w:rPr>
-          <w:rFonts w:ascii="Consolas" w:eastAsia="Times New Roman" w:hAnsi="Consolas" w:cs="Times New Roman"/>
-          <w:color w:val="E06C75"/>
-          <w:kern w:val="0"/>
-          <w:sz w:val="21"/>
-          <w:szCs w:val="21"/>
-          <w:lang w:val="en-US" w:eastAsia="ru-RU"/>
-          <w14:ligatures w14:val="none"/>
-        </w:rPr>
-        <w:t>push</w:t>
-      </w:r>
-      <w:r>
-        <w:rPr>
-          <w:rFonts w:ascii="Consolas" w:eastAsia="Times New Roman" w:hAnsi="Consolas" w:cs="Times New Roman"/>
-          <w:color w:val="ABB2BF"/>
-          <w:kern w:val="0"/>
-          <w:sz w:val="21"/>
-          <w:szCs w:val="21"/>
-          <w:lang w:val="en-US" w:eastAsia="ru-RU"/>
-          <w14:ligatures w14:val="none"/>
-        </w:rPr>
-        <w:t xml:space="preserve">: </w:t>
-      </w:r>
-      <w:r>
-        <w:rPr>
-          <w:rFonts w:ascii="Consolas" w:eastAsia="Times New Roman" w:hAnsi="Consolas" w:cs="Times New Roman"/>
-          <w:color w:val="D19A66"/>
-          <w:kern w:val="0"/>
-          <w:sz w:val="21"/>
-          <w:szCs w:val="21"/>
-          <w:lang w:val="en-US" w:eastAsia="ru-RU"/>
-          <w14:ligatures w14:val="none"/>
-        </w:rPr>
-        <w:t>true</w:t>
-      </w:r>
-    </w:p>
-    <w:p>
-      <w:pPr>
-        <w:shd w:val="clear" w:color="auto" w:fill="282C34"/>
-        <w:spacing w:after="0" w:line="285" w:lineRule="atLeast"/>
-        <w:rPr>
-          <w:rFonts w:ascii="Consolas" w:eastAsia="Times New Roman" w:hAnsi="Consolas" w:cs="Times New Roman"/>
-          <w:color w:val="ABB2BF"/>
-          <w:kern w:val="0"/>
-          <w:sz w:val="21"/>
-          <w:szCs w:val="21"/>
-          <w:lang w:val="en-US" w:eastAsia="ru-RU"/>
-          <w14:ligatures w14:val="none"/>
-        </w:rPr>
-      </w:pPr>
-      <w:r>
-        <w:rPr>
-          <w:rFonts w:ascii="Consolas" w:eastAsia="Times New Roman" w:hAnsi="Consolas" w:cs="Times New Roman"/>
-          <w:color w:val="ABB2BF"/>
-          <w:kern w:val="0"/>
-          <w:sz w:val="21"/>
-          <w:szCs w:val="21"/>
-          <w:lang w:val="en-US" w:eastAsia="ru-RU"/>
-          <w14:ligatures w14:val="none"/>
-        </w:rPr>
-        <w:t xml:space="preserve">          </w:t>
-      </w:r>
-      <w:r>
-        <w:rPr>
-          <w:rFonts w:ascii="Consolas" w:eastAsia="Times New Roman" w:hAnsi="Consolas" w:cs="Times New Roman"/>
-          <w:color w:val="E06C75"/>
-          <w:kern w:val="0"/>
-          <w:sz w:val="21"/>
-          <w:szCs w:val="21"/>
-          <w:lang w:val="en-US" w:eastAsia="ru-RU"/>
-          <w14:ligatures w14:val="none"/>
-        </w:rPr>
-        <w:t>tags</w:t>
-      </w:r>
-      <w:r>
-        <w:rPr>
-          <w:rFonts w:ascii="Consolas" w:eastAsia="Times New Roman" w:hAnsi="Consolas" w:cs="Times New Roman"/>
-          <w:color w:val="ABB2BF"/>
-          <w:kern w:val="0"/>
-          <w:sz w:val="21"/>
-          <w:szCs w:val="21"/>
-          <w:lang w:val="en-US" w:eastAsia="ru-RU"/>
-          <w14:ligatures w14:val="none"/>
-        </w:rPr>
-        <w:t xml:space="preserve">: </w:t>
-      </w:r>
-      <w:r>
-        <w:rPr>
-          <w:rFonts w:ascii="Consolas" w:eastAsia="Times New Roman" w:hAnsi="Consolas" w:cs="Times New Roman"/>
-          <w:color w:val="98C379"/>
-          <w:kern w:val="0"/>
-          <w:sz w:val="21"/>
-          <w:szCs w:val="21"/>
-          <w:lang w:val="en-US" w:eastAsia="ru-RU"/>
-          <w14:ligatures w14:val="none"/>
-        </w:rPr>
-        <w:t>$</w:t>
-      </w:r>
-      <w:proofErr w:type="gramStart"/>
-      <w:r>
-        <w:rPr>
-          <w:rFonts w:ascii="Consolas" w:eastAsia="Times New Roman" w:hAnsi="Consolas" w:cs="Times New Roman"/>
-          <w:color w:val="98C379"/>
-          <w:kern w:val="0"/>
-          <w:sz w:val="21"/>
-          <w:szCs w:val="21"/>
-          <w:lang w:val="en-US" w:eastAsia="ru-RU"/>
-          <w14:ligatures w14:val="none"/>
-        </w:rPr>
-        <w:t xml:space="preserve">{{ </w:t>
-      </w:r>
-      <w:proofErr w:type="spellStart"/>
-      <w:r>
-        <w:rPr>
-          <w:rFonts w:ascii="Consolas" w:eastAsia="Times New Roman" w:hAnsi="Consolas" w:cs="Times New Roman"/>
-          <w:color w:val="98C379"/>
-          <w:kern w:val="0"/>
-          <w:sz w:val="21"/>
-          <w:szCs w:val="21"/>
-          <w:lang w:val="en-US" w:eastAsia="ru-RU"/>
-          <w14:ligatures w14:val="none"/>
-        </w:rPr>
-        <w:t>vars</w:t>
-      </w:r>
-      <w:proofErr w:type="gramEnd"/>
-      <w:r>
-        <w:rPr>
-          <w:rFonts w:ascii="Consolas" w:eastAsia="Times New Roman" w:hAnsi="Consolas" w:cs="Times New Roman"/>
-          <w:color w:val="98C379"/>
-          <w:kern w:val="0"/>
-          <w:sz w:val="21"/>
-          <w:szCs w:val="21"/>
-          <w:lang w:val="en-US" w:eastAsia="ru-RU"/>
-          <w14:ligatures w14:val="none"/>
-        </w:rPr>
-        <w:t>.DOCKERHUB_</w:t>
-      </w:r>
-      <w:proofErr w:type="gramStart"/>
-      <w:r>
-        <w:rPr>
-          <w:rFonts w:ascii="Consolas" w:eastAsia="Times New Roman" w:hAnsi="Consolas" w:cs="Times New Roman"/>
-          <w:color w:val="98C379"/>
-          <w:kern w:val="0"/>
-          <w:sz w:val="21"/>
-          <w:szCs w:val="21"/>
-          <w:lang w:val="en-US" w:eastAsia="ru-RU"/>
-          <w14:ligatures w14:val="none"/>
-        </w:rPr>
-        <w:t>USERNAME</w:t>
-      </w:r>
-      <w:proofErr w:type="spellEnd"/>
-      <w:r>
-        <w:rPr>
-          <w:rFonts w:ascii="Consolas" w:eastAsia="Times New Roman" w:hAnsi="Consolas" w:cs="Times New Roman"/>
-          <w:color w:val="98C379"/>
-          <w:kern w:val="0"/>
-          <w:sz w:val="21"/>
-          <w:szCs w:val="21"/>
-          <w:lang w:val="en-US" w:eastAsia="ru-RU"/>
-          <w14:ligatures w14:val="none"/>
-        </w:rPr>
-        <w:t xml:space="preserve"> }}/</w:t>
-      </w:r>
-      <w:proofErr w:type="spellStart"/>
-      <w:proofErr w:type="gramEnd"/>
-      <w:r>
-        <w:rPr>
-          <w:rFonts w:ascii="Consolas" w:eastAsia="Times New Roman" w:hAnsi="Consolas" w:cs="Times New Roman"/>
-          <w:color w:val="98C379"/>
-          <w:kern w:val="0"/>
-          <w:sz w:val="21"/>
-          <w:szCs w:val="21"/>
-          <w:lang w:val="en-US" w:eastAsia="ru-RU"/>
-          <w14:ligatures w14:val="none"/>
-        </w:rPr>
-        <w:t>my-</w:t>
-      </w:r>
-      <w:proofErr w:type="gramStart"/>
-      <w:r>
-        <w:rPr>
-          <w:rFonts w:ascii="Consolas" w:eastAsia="Times New Roman" w:hAnsi="Consolas" w:cs="Times New Roman"/>
-          <w:color w:val="98C379"/>
-          <w:kern w:val="0"/>
-          <w:sz w:val="21"/>
-          <w:szCs w:val="21"/>
-          <w:lang w:val="en-US" w:eastAsia="ru-RU"/>
-          <w14:ligatures w14:val="none"/>
-        </w:rPr>
-        <w:t>app:latest</w:t>
-      </w:r>
-      <w:proofErr w:type="spellEnd"/>
-      <w:proofErr w:type="gramEnd"/>
     </w:p>
     <w:p>
       <w:pPr>
@@ -7151,7 +6763,6 @@
           <w:rFonts w:ascii="Times New Roman" w:hAnsi="Times New Roman" w:cs="Times New Roman"/>
           <w:sz w:val="28"/>
           <w:szCs w:val="28"/>
-          <w:lang w:val="en-US"/>
         </w:rPr>
       </w:pPr>
       <w:r>
@@ -7174,6 +6785,7 @@
       <w:r>
         <w:rPr>
           <w:rFonts w:ascii="Times New Roman" w:hAnsi="Times New Roman" w:cs="Times New Roman"/>
+          <w:noProof/>
           <w:sz w:val="28"/>
           <w:szCs w:val="28"/>
         </w:rPr>
@@ -7226,6 +6838,7 @@
       <w:r>
         <w:rPr>
           <w:rFonts w:ascii="Times New Roman" w:hAnsi="Times New Roman" w:cs="Times New Roman"/>
+          <w:noProof/>
           <w:sz w:val="28"/>
           <w:szCs w:val="28"/>
         </w:rPr>
@@ -7314,31 +6927,7 @@
           <w:szCs w:val="28"/>
         </w:rPr>
         <w:tab/>
-        <w:t>В ходе выполнения данной лабораторной работы я п</w:t>
-      </w:r>
-      <w:r>
-        <w:rPr>
-          <w:rFonts w:ascii="Times New Roman" w:hAnsi="Times New Roman" w:cs="Times New Roman"/>
-          <w:sz w:val="28"/>
-          <w:szCs w:val="28"/>
-        </w:rPr>
-        <w:t>ознакоми</w:t>
-      </w:r>
-      <w:r>
-        <w:rPr>
-          <w:rFonts w:ascii="Times New Roman" w:hAnsi="Times New Roman" w:cs="Times New Roman"/>
-          <w:sz w:val="28"/>
-          <w:szCs w:val="28"/>
-        </w:rPr>
-        <w:t>л</w:t>
-      </w:r>
-      <w:r>
-        <w:rPr>
-          <w:rFonts w:ascii="Times New Roman" w:hAnsi="Times New Roman" w:cs="Times New Roman"/>
-          <w:sz w:val="28"/>
-          <w:szCs w:val="28"/>
-        </w:rPr>
-        <w:t xml:space="preserve">ся с методологией </w:t>
+        <w:t xml:space="preserve">В ходе выполнения данной лабораторной работы я познакомился с методологией </w:t>
       </w:r>
       <w:r>
         <w:rPr>
@@ -7380,23 +6969,7 @@
           <w:sz w:val="28"/>
           <w:szCs w:val="28"/>
         </w:rPr>
-        <w:t>научи</w:t>
-      </w:r>
-      <w:r>
-        <w:rPr>
-          <w:rFonts w:ascii="Times New Roman" w:hAnsi="Times New Roman" w:cs="Times New Roman"/>
-          <w:sz w:val="28"/>
-          <w:szCs w:val="28"/>
-        </w:rPr>
-        <w:t>л</w:t>
-      </w:r>
-      <w:r>
-        <w:rPr>
-          <w:rFonts w:ascii="Times New Roman" w:hAnsi="Times New Roman" w:cs="Times New Roman"/>
-          <w:sz w:val="28"/>
-          <w:szCs w:val="28"/>
-        </w:rPr>
-        <w:t xml:space="preserve">ся работать с инструментом </w:t>
+        <w:t xml:space="preserve">научился работать с инструментом </w:t>
       </w:r>
       <w:r>
         <w:rPr>
@@ -7500,6 +7073,51 @@
           <w:rFonts w:ascii="Times New Roman" w:hAnsi="Times New Roman" w:cs="Times New Roman"/>
           <w:sz w:val="28"/>
           <w:szCs w:val="28"/>
+          <w:lang w:val="en-US"/>
+        </w:rPr>
+      </w:pPr>
+    </w:p>
+    <w:p>
+      <w:pPr>
+        <w:jc w:val="both"/>
+        <w:rPr>
+          <w:rFonts w:ascii="Times New Roman" w:hAnsi="Times New Roman" w:cs="Times New Roman"/>
+          <w:sz w:val="28"/>
+          <w:szCs w:val="28"/>
+          <w:lang w:val="en-US"/>
+        </w:rPr>
+      </w:pPr>
+    </w:p>
+    <w:p>
+      <w:pPr>
+        <w:jc w:val="both"/>
+        <w:rPr>
+          <w:rFonts w:ascii="Times New Roman" w:hAnsi="Times New Roman" w:cs="Times New Roman"/>
+          <w:sz w:val="28"/>
+          <w:szCs w:val="28"/>
+          <w:lang w:val="en-US"/>
+        </w:rPr>
+      </w:pPr>
+    </w:p>
+    <w:p>
+      <w:pPr>
+        <w:jc w:val="both"/>
+        <w:rPr>
+          <w:rFonts w:ascii="Times New Roman" w:hAnsi="Times New Roman" w:cs="Times New Roman"/>
+          <w:sz w:val="28"/>
+          <w:szCs w:val="28"/>
+          <w:lang w:val="en-US"/>
+        </w:rPr>
+      </w:pPr>
+    </w:p>
+    <w:p>
+      <w:pPr>
+        <w:jc w:val="both"/>
+        <w:rPr>
+          <w:rFonts w:ascii="Times New Roman" w:hAnsi="Times New Roman" w:cs="Times New Roman"/>
+          <w:sz w:val="28"/>
+          <w:szCs w:val="28"/>
+          <w:lang w:val="en-US"/>
         </w:rPr>
       </w:pPr>
     </w:p>
@@ -7547,57 +7165,15 @@
           <w:sz w:val="28"/>
           <w:szCs w:val="28"/>
         </w:rPr>
-        <w:t>Как CI/CD помогает в разработке?</w:t>
-      </w:r>
-      <w:r>
-        <w:rPr>
-          <w:rFonts w:ascii="Times New Roman" w:hAnsi="Times New Roman" w:cs="Times New Roman"/>
-          <w:b/>
-          <w:bCs/>
-          <w:sz w:val="28"/>
-          <w:szCs w:val="28"/>
-        </w:rPr>
-        <w:t xml:space="preserve"> </w:t>
-      </w:r>
-      <w:r>
-        <w:rPr>
-          <w:rFonts w:ascii="Times New Roman" w:hAnsi="Times New Roman" w:cs="Times New Roman"/>
-          <w:sz w:val="28"/>
-          <w:szCs w:val="28"/>
-        </w:rPr>
-        <w:t>CI/CD помогает организациям избежать ошибок и сбоев в коде, поддерживая непрерывный цикл разработки и обновления программного обеспечения. Поскольку CI/CD автоматизирует ручное вмешательство человека,</w:t>
-      </w:r>
-      <w:r>
-        <w:rPr>
-          <w:rFonts w:ascii="Times New Roman" w:hAnsi="Times New Roman" w:cs="Times New Roman"/>
-          <w:sz w:val="28"/>
-          <w:szCs w:val="28"/>
-        </w:rPr>
-        <w:t xml:space="preserve"> </w:t>
-      </w:r>
-      <w:r>
-        <w:rPr>
-          <w:rFonts w:ascii="Times New Roman" w:hAnsi="Times New Roman" w:cs="Times New Roman"/>
-          <w:sz w:val="28"/>
-          <w:szCs w:val="28"/>
-        </w:rPr>
-        <w:t>время простоя сводится к минимуму, а релизы кода происходят быстрее, снижается</w:t>
-      </w:r>
-      <w:r>
-        <w:rPr>
-          <w:rFonts w:ascii="Times New Roman" w:hAnsi="Times New Roman" w:cs="Times New Roman"/>
-          <w:sz w:val="28"/>
-          <w:szCs w:val="28"/>
-        </w:rPr>
-        <w:t xml:space="preserve"> </w:t>
-      </w:r>
-      <w:r>
-        <w:rPr>
-          <w:rFonts w:ascii="Times New Roman" w:hAnsi="Times New Roman" w:cs="Times New Roman"/>
-          <w:sz w:val="28"/>
-          <w:szCs w:val="28"/>
-        </w:rPr>
-        <w:t>человеческий фактор.</w:t>
+        <w:t xml:space="preserve">Как CI/CD помогает в разработке? </w:t>
+      </w:r>
+      <w:r>
+        <w:rPr>
+          <w:rFonts w:ascii="Times New Roman" w:hAnsi="Times New Roman" w:cs="Times New Roman"/>
+          <w:sz w:val="28"/>
+          <w:szCs w:val="28"/>
+        </w:rPr>
+        <w:t>CI/CD помогает организациям избежать ошибок и сбоев в коде, поддерживая непрерывный цикл разработки и обновления программного обеспечения. Поскольку CI/CD автоматизирует ручное вмешательство человека, время простоя сводится к минимуму, а релизы кода происходят быстрее, снижается человеческий фактор.</w:t>
       </w:r>
     </w:p>
     <w:p>
@@ -7794,6 +7370,7 @@
           <w:rFonts w:ascii="Times New Roman" w:hAnsi="Times New Roman" w:cs="Times New Roman"/>
           <w:sz w:val="28"/>
           <w:szCs w:val="28"/>
+          <w:lang w:val="en-US"/>
         </w:rPr>
       </w:pPr>
     </w:p>
@@ -8665,6 +8242,7 @@
   <w:style w:type="character" w:default="1" w:styleId="a0">
     <w:name w:val="Default Paragraph Font"/>
     <w:uiPriority w:val="1"/>
+    <w:semiHidden/>
     <w:unhideWhenUsed/>
   </w:style>
   <w:style w:type="table" w:default="1" w:styleId="a1">

</xml_diff>